<commit_message>
feat: modernize encore ticketing experience
</commit_message>
<xml_diff>
--- a/ENCORE票务管理系统-软件需求规格说明书-V1.0.docx
+++ b/ENCORE票务管理系统-软件需求规格说明书-V1.0.docx
@@ -307,7 +307,7 @@
           <w:sz w:val="48"/>
           <w:szCs w:val="48"/>
         </w:rPr>
-        <w:t>版本：V1.0</w:t>
+        <w:t>版本：V1.1</w:t>
       </w:r>
     </w:p>
     <w:p>
@@ -2709,7 +2709,11 @@
             <w:noWrap w:val="0"/>
             <w:vAlign w:val="top"/>
           </w:tcPr>
-          <w:p/>
+          <w:p>
+            <w:r>
+              <w:t>V1.1</w:t>
+            </w:r>
+          </w:p>
         </w:tc>
         <w:tc>
           <w:tcPr>
@@ -2717,7 +2721,11 @@
             <w:noWrap w:val="0"/>
             <w:vAlign w:val="top"/>
           </w:tcPr>
-          <w:p/>
+          <w:p>
+            <w:r>
+              <w:t>对齐当前实现的修订: 重写类图 / ER / 用例图等 UML, 校正 REST 与 WebSocket 接口、数据模型 (13 张表) 与单列角色鉴权; 新增区域售票 (ZONED/MIXED) 与拼座邀请用例</w:t>
+            </w:r>
+          </w:p>
         </w:tc>
         <w:tc>
           <w:tcPr>
@@ -2733,7 +2741,11 @@
             <w:noWrap w:val="0"/>
             <w:vAlign w:val="top"/>
           </w:tcPr>
-          <w:p/>
+          <w:p>
+            <w:r>
+              <w:t>2026-06-05</w:t>
+            </w:r>
+          </w:p>
         </w:tc>
         <w:tc>
           <w:tcPr>
@@ -2741,7 +2753,11 @@
             <w:noWrap w:val="0"/>
             <w:vAlign w:val="top"/>
           </w:tcPr>
-          <w:p/>
+          <w:p>
+            <w:r>
+              <w:t>对齐实现修订版</w:t>
+            </w:r>
+          </w:p>
         </w:tc>
       </w:tr>
       <w:tr>
@@ -6002,7 +6018,7 @@
         <w:pStyle w:val="25"/>
       </w:pPr>
       <w:r>
-        <w:t>版本号: V1.0</w:t>
+        <w:t>版本号: V1.1</w:t>
       </w:r>
     </w:p>
     <w:p>
@@ -6727,7 +6743,7 @@
           </w:tcPr>
           <w:p>
             <w:r>
-              <w:t>基于 WebSocket / STOMP 协议, 同一场次内任一用户的锁座 / 释放动作通过 /topic/schedule/{id}/seat 主题秒级推送给该场次全部在线用户, 屏幕端无需轮询即可同步显示.</w:t>
+              <w:t>基于 WebSocket / STOMP 协议, 同一场次内任一用户的锁座 / 释放 / 售出动作通过 /topic/schedules/{id}/seats 主题广播给全部在线订阅者, P95 ≤ 200ms, 屏幕端无需轮询即可实时同步座位与区域状态.</w:t>
             </w:r>
           </w:p>
         </w:tc>
@@ -6861,7 +6877,7 @@
           </w:tcPr>
           <w:p>
             <w:r>
-              <w:t>黑金指挥中心风格</w:t>
+              <w:t>深色数据看板风格</w:t>
             </w:r>
           </w:p>
         </w:tc>
@@ -6871,7 +6887,7 @@
           </w:tcPr>
           <w:p>
             <w:r>
-              <w:t>管理端数据看板采用全黑底 (#0F0F0F) + 暗红 (#5B0E0E) + 金色 (#C8A35E) 高亮的深色 BI 视觉语言, 辅以 Sankey 漏斗与座位热力图等高密度图表, 类似机场塔台 / 监控指挥中心.</w:t>
+              <w:t>管理端数据看板采用深色底 + 金色 (#C8955A) 高亮、灰阶坐标 (#8A8480) 的 ECharts 深色 BI 视觉语言, 与用户端沉浸式剧院风格呼应, 突出营收 / 订单 / 售票 / 检票关键指标.</w:t>
             </w:r>
           </w:p>
         </w:tc>
@@ -7794,7 +7810,7 @@
           </w:tcPr>
           <w:p>
             <w:r>
-              <w:t>DDD</w:t>
+              <w:t>CAS</w:t>
             </w:r>
           </w:p>
         </w:tc>
@@ -7804,7 +7820,7 @@
           </w:tcPr>
           <w:p>
             <w:r>
-              <w:t>Domain-Driven Design (领域驱动设计)</w:t>
+              <w:t>Compare-And-Swap (比较并交换, 用于区域库存原子更新)</w:t>
             </w:r>
           </w:p>
         </w:tc>
@@ -8785,7 +8801,7 @@
         <w:pStyle w:val="25"/>
       </w:pPr>
       <w:r>
-        <w:t>信息中心: 维护账号体系、权限分配、操作日志、系统运维.</w:t>
+        <w:t>信息中心: 维护员工账号体系、角色分配、系统参数与运维.</w:t>
       </w:r>
     </w:p>
     <w:p>
@@ -9187,7 +9203,7 @@
           </w:tcPr>
           <w:p>
             <w:r>
-              <w:t>维护用户与角色、权限分配、操作日志查阅、系统参数配置</w:t>
+              <w:t>维护员工账号与角色分配 (role 单列)、系统参数配置</w:t>
             </w:r>
           </w:p>
         </w:tc>
@@ -9223,7 +9239,7 @@
       <w:r>
         <w:drawing>
           <wp:inline distT="0" distB="0" distL="114300" distR="114300">
-            <wp:extent cx="5039995" cy="5715000"/>
+            <wp:extent cx="5039995" cy="5279259"/>
             <wp:effectExtent l="0" t="0" r="1905" b="0"/>
             <wp:docPr id="1" name="Picture 1"/>
             <wp:cNvGraphicFramePr>
@@ -9247,7 +9263,7 @@
                   <pic:spPr>
                     <a:xfrm>
                       <a:off x="0" y="0"/>
-                      <a:ext cx="5040000" cy="5715000"/>
+                      <a:ext cx="5039995" cy="5279259"/>
                     </a:xfrm>
                     <a:prstGeom prst="rect">
                       <a:avLst/>
@@ -9274,87 +9290,87 @@
         <w:pStyle w:val="25"/>
       </w:pPr>
       <w:r>
-        <w:t>① 票务管理员在后台创建演出分类与剧目档案, 上传剧目海报、简介、时长等基本信息;</w:t>
-      </w:r>
-    </w:p>
-    <w:p>
-      <w:pPr>
-        <w:pStyle w:val="25"/>
-      </w:pPr>
-      <w:r>
-        <w:t>② 票务管理员维护演出厅信息以及演出厅的座位行列与区域布局 (hall_seat 表);</w:t>
-      </w:r>
-    </w:p>
-    <w:p>
-      <w:pPr>
-        <w:pStyle w:val="25"/>
-      </w:pPr>
-      <w:r>
-        <w:t>③ 票务管理员为剧目创建具体演出场次, 指定演出厅与开演时间, 并设置场次票价分区;</w:t>
-      </w:r>
-    </w:p>
-    <w:p>
-      <w:pPr>
-        <w:pStyle w:val="25"/>
-      </w:pPr>
-      <w:r>
-        <w:t>④ 系统依据演出厅座位布局自动生成该场次的座位票池 (schedule_seat 表, 全部 AVAILABLE);</w:t>
-      </w:r>
-    </w:p>
-    <w:p>
-      <w:pPr>
-        <w:pStyle w:val="25"/>
-      </w:pPr>
-      <w:r>
-        <w:t>⑤ 场次审核通过后, 票务管理员将场次状态从 DRAFT 切换为 ON_SALE 开始售票;</w:t>
-      </w:r>
-    </w:p>
-    <w:p>
-      <w:pPr>
-        <w:pStyle w:val="25"/>
-      </w:pPr>
-      <w:r>
-        <w:t>⑥ 注册用户登录后浏览演出, 进入演出详情页, 选定具体场次进入可视化选座页;</w:t>
-      </w:r>
-    </w:p>
-    <w:p>
-      <w:pPr>
-        <w:pStyle w:val="25"/>
-      </w:pPr>
-      <w:r>
-        <w:t>⑦ 用户在座位图中选择一个或多个 AVAILABLE 座位, 系统通过 Redis 临时锁定座位 (LOCKED) 并创建待支付订单 (PENDING_PAYMENT), 启动默认 15 分钟订单倒计时;</w:t>
-      </w:r>
-    </w:p>
-    <w:p>
-      <w:pPr>
-        <w:pStyle w:val="25"/>
-      </w:pPr>
-      <w:r>
-        <w:t>⑧ 用户在倒计时窗口内提交模拟支付, 订单状态变为 PAID, 座位状态变为 SOLD, 系统批量生成电子票 (ticket_item, UNUSED) 并下发票号与二维码模拟码;</w:t>
-      </w:r>
-    </w:p>
-    <w:p>
-      <w:pPr>
-        <w:pStyle w:val="25"/>
-      </w:pPr>
-      <w:r>
-        <w:t>⑨ 若用户未在倒计时内完成支付, 订单自动变为 EXPIRED, 系统释放对应座位 (LOCKED → AVAILABLE);</w:t>
-      </w:r>
-    </w:p>
-    <w:p>
-      <w:pPr>
-        <w:pStyle w:val="25"/>
-      </w:pPr>
-      <w:r>
-        <w:t>⑩ 演出当日, 检票员在检票端输入或扫描票号, 系统核验票据状态、场次时间, 通过则票据置为 CHECKED_IN 并写入 checkin_record;</w:t>
-      </w:r>
-    </w:p>
-    <w:p>
-      <w:pPr>
-        <w:pStyle w:val="25"/>
-      </w:pPr>
-      <w:r>
-        <w:t>⑪ 演出结束后, 票务管理员通过数据看板查看销售额、订单数、上座率、热门演出排行等指标, 支撑后续排期与运营决策.</w:t>
+        <w:t>① 票务管理员在后台创建剧目档案 (标题、海报、简介、时长、分类、票价区间);</w:t>
+      </w:r>
+    </w:p>
+    <w:p>
+      <w:pPr>
+        <w:pStyle w:val="25"/>
+      </w:pPr>
+      <w:r>
+        <w:t>② 票务管理员维护场馆 venue、演出厅 venue_hall 与座位布局 seat_layout (区域 + 座位, 支持 SEATED / ZONED / MIXED);</w:t>
+      </w:r>
+    </w:p>
+    <w:p>
+      <w:pPr>
+        <w:pStyle w:val="25"/>
+      </w:pPr>
+      <w:r>
+        <w:t>③ 票务管理员为剧目创建演出场次, 绑定演出厅与已发布布局, 指定开演时间与售票模式;</w:t>
+      </w:r>
+    </w:p>
+    <w:p>
+      <w:pPr>
+        <w:pStyle w:val="25"/>
+      </w:pPr>
+      <w:r>
+        <w:t>④ 系统快照布局生成场次座位票池 schedule_seat 与区域库存 schedule_area_inventory (座位 AVAILABLE、区域计数初始化);</w:t>
+      </w:r>
+    </w:p>
+    <w:p>
+      <w:pPr>
+        <w:pStyle w:val="25"/>
+      </w:pPr>
+      <w:r>
+        <w:t>⑤ 校验同厅时间冲突后, 票务管理员发布场次 (publishStatus=PUBLISHED) 并置为 ON_SALE 开始售票;</w:t>
+      </w:r>
+    </w:p>
+    <w:p>
+      <w:pPr>
+        <w:pStyle w:val="25"/>
+      </w:pPr>
+      <w:r>
+        <w:t>⑥ 注册用户登录后浏览演出, 进入演出详情页, 选定具体场次进入选座 / 区域购票页;</w:t>
+      </w:r>
+    </w:p>
+    <w:p>
+      <w:pPr>
+        <w:pStyle w:val="25"/>
+      </w:pPr>
+      <w:r>
+        <w:t>⑦ SEATED 场次选 1~6 个座位经 Redis 临时锁定 (LOCKED), ZONED 场次选区域与张数 (1~4); 提交后创建待支付订单 (PENDING_PAYMENT), 启动 15 分钟倒计时;</w:t>
+      </w:r>
+    </w:p>
+    <w:p>
+      <w:pPr>
+        <w:pStyle w:val="25"/>
+      </w:pPr>
+      <w:r>
+        <w:t>⑧ 用户在倒计时内模拟支付: 订单转 PAID, 座位置 SOLD 或区域库存 sold 累加, 票据由 RESERVED 翻转为 UNUSED 并展示票号 ticketCode;</w:t>
+      </w:r>
+    </w:p>
+    <w:p>
+      <w:pPr>
+        <w:pStyle w:val="25"/>
+      </w:pPr>
+      <w:r>
+        <w:t>⑨ 若超时未支付, 订单自动 EXPIRED, 系统释放座位锁 (LOCKED → AVAILABLE) 或回滚区域库存 (locked → available);</w:t>
+      </w:r>
+    </w:p>
+    <w:p>
+      <w:pPr>
+        <w:pStyle w:val="25"/>
+      </w:pPr>
+      <w:r>
+        <w:t>⑩ 演出当日 (开演前 2 小时起), 检票员在检票端输入或扫描票号, 系统校验票据与场次后将票据翻转为 CHECKED_IN (无独立 checkin_record 表);</w:t>
+      </w:r>
+    </w:p>
+    <w:p>
+      <w:pPr>
+        <w:pStyle w:val="25"/>
+      </w:pPr>
+      <w:r>
+        <w:t>⑪ 演出前后, 票务管理员通过数据看板查看营收、订单数、近 7 日票房趋势、Top5 热门演出与检票汇总, 支撑排期与运营决策。</w:t>
       </w:r>
     </w:p>
     <w:p>
@@ -9653,7 +9669,7 @@
           </w:tcPr>
           <w:p>
             <w:r>
-              <w:t>热门演出 TOP 10</w:t>
+              <w:t>热门演出 TOP 5</w:t>
             </w:r>
           </w:p>
         </w:tc>
@@ -9673,7 +9689,7 @@
           </w:tcPr>
           <w:p>
             <w:r>
-              <w:t>按近 30 日销售额对剧目排行</w:t>
+              <w:t>按累计销量与营收对在售剧目排行 (Top5)</w:t>
             </w:r>
           </w:p>
         </w:tc>
@@ -9923,7 +9939,7 @@
       <w:r>
         <w:drawing>
           <wp:inline distT="0" distB="0" distL="114300" distR="114300">
-            <wp:extent cx="5039995" cy="3905250"/>
+            <wp:extent cx="5039995" cy="4355995"/>
             <wp:effectExtent l="0" t="0" r="1905" b="6350"/>
             <wp:docPr id="2" name="Picture 2"/>
             <wp:cNvGraphicFramePr>
@@ -9947,7 +9963,7 @@
                   <pic:spPr>
                     <a:xfrm>
                       <a:off x="0" y="0"/>
-                      <a:ext cx="5040000" cy="3905855"/>
+                      <a:ext cx="5039995" cy="4355995"/>
                     </a:xfrm>
                     <a:prstGeom prst="rect">
                       <a:avLst/>
@@ -9998,7 +10014,7 @@
       <w:r>
         <w:drawing>
           <wp:inline distT="0" distB="0" distL="114300" distR="114300">
-            <wp:extent cx="5039995" cy="6706870"/>
+            <wp:extent cx="5039995" cy="6451193"/>
             <wp:effectExtent l="0" t="0" r="1905" b="11430"/>
             <wp:docPr id="3" name="Picture 3"/>
             <wp:cNvGraphicFramePr>
@@ -10022,7 +10038,7 @@
                   <pic:spPr>
                     <a:xfrm>
                       <a:off x="0" y="0"/>
-                      <a:ext cx="5040000" cy="6707297"/>
+                      <a:ext cx="5039995" cy="6451193"/>
                     </a:xfrm>
                     <a:prstGeom prst="rect">
                       <a:avLst/>
@@ -10445,7 +10461,7 @@
           </w:tcPr>
           <w:p>
             <w:r>
-              <w:t>已注册并登录的最终消费者. 可执行可视化选座、创建订单、模拟支付、查看我的订单、查看电子票与二维码模拟码等核心购票动作.</w:t>
+              <w:t>已注册并登录的最终消费者. 可执行可视化选座与区域购票 (SEATED / ZONED / MIXED)、创建订单、模拟支付、发起或加入拼座邀请、查看我的订单与电子票、舞台视角预览等核心用例.</w:t>
             </w:r>
           </w:p>
         </w:tc>
@@ -10649,7 +10665,7 @@
           </w:tcPr>
           <w:p>
             <w:r>
-              <w:t>信息中心岗位. 负责用户与角色管理、权限分配、操作日志、基础参数配置. 不参与剧目和票务业务.</w:t>
+              <w:t>信息中心岗位. 负责员工账号管理 (创建 / 禁用 / 重置密码) 与角色分配 (user / admin / checker / sysadmin)、系统参数配置. 不参与剧目和票务业务.</w:t>
             </w:r>
           </w:p>
         </w:tc>
@@ -10672,31 +10688,31 @@
     </w:p>
     <w:p>
       <w:r>
-        <w:t>ENCORE 票务管理系统从用户端、管理端、检票端、系统管理端四类使用界面切入, 整体功能模块归纳为 14 大类, 覆盖 37 个功能用例。4.2 节先给出功能模块、数据库实体、全部用例清单和对应 UML 用例图; 4.3 以后再按模板格式展开核心用例。</w:t>
-      </w:r>
-    </w:p>
-    <w:p>
-      <w:pPr>
-        <w:pStyle w:val="25"/>
-      </w:pPr>
-      <w:r>
-        <w:t>用户端: 用户注册与登录、演出浏览与搜索、演出详情查看、场次选择、可视化选座、订单创建与模拟支付、我的订单、我的电子票、舞台视角预览、拼座邀请、退票/改签申请、个性化推荐;</w:t>
-      </w:r>
-    </w:p>
-    <w:p>
-      <w:pPr>
-        <w:pStyle w:val="25"/>
-      </w:pPr>
-      <w:r>
-        <w:t>管理端: 用户与角色管理、剧目信息管理、演出分类管理、演出厅管理、座位布局管理、场次排期管理、批量排期、场次座位票池管理、订单与退改管理、公告管理、优惠策略管理、数据统计看板、报表导出、操作日志管理;</w:t>
-      </w:r>
-    </w:p>
-    <w:p>
-      <w:pPr>
-        <w:pStyle w:val="25"/>
-      </w:pPr>
-      <w:r>
-        <w:t>检票端: 票号 / 二维码模拟码输入、票据核验、检票入场、异常处理、弱网离线检票缓存与恢复同步; 系统管理端: 系统参数配置、权限分配、操作日志审计。</w:t>
+        <w:t>ENCORE 票务管理系统从用户端、管理端、检票端、系统管理端四类界面切入, 覆盖游客、注册用户、票务管理员、检票员、系统管理员 5 类角色的全部用例; 其中 4.3 ~ 4.13 共 11 个核心用例按模板字段详述。4.2 节先给出功能模块、数据库实体、用例清单与对应 UML 用例图。</w:t>
+      </w:r>
+    </w:p>
+    <w:p>
+      <w:pPr>
+        <w:pStyle w:val="25"/>
+      </w:pPr>
+      <w:r>
+        <w:t>用户端: 用户注册与登录、演出浏览与搜索、演出详情查看、场次选择、可视化选座与区域购票、订单创建与模拟支付、我的订单、我的电子票、舞台视角预览、拼座邀请、个性化推荐;</w:t>
+      </w:r>
+    </w:p>
+    <w:p>
+      <w:pPr>
+        <w:pStyle w:val="25"/>
+      </w:pPr>
+      <w:r>
+        <w:t>管理端: 员工账号管理 (建 / 禁用 / 重置密码 / 角色分配)、剧目信息管理、场馆与演出厅管理、座位布局管理、场次排期管理、场次座位票池与区域库存管理、订单与退款管理、数据统计看板; 规划中: 公告、优惠策略、批量排期、报表导出;</w:t>
+      </w:r>
+    </w:p>
+    <w:p>
+      <w:pPr>
+        <w:pStyle w:val="25"/>
+      </w:pPr>
+      <w:r>
+        <w:t>检票端: 票号输入 / 扫描、票据核验、检票入场、异常处理; 系统管理端: 员工账号管理与角色分配、系统参数配置。</w:t>
       </w:r>
     </w:p>
     <w:p>
@@ -10716,7 +10732,7 @@
       <w:r>
         <w:drawing>
           <wp:inline distT="0" distB="0" distL="114300" distR="114300">
-            <wp:extent cx="5039995" cy="9383395"/>
+            <wp:extent cx="5039995" cy="7255720"/>
             <wp:effectExtent l="0" t="0" r="1905" b="1905"/>
             <wp:docPr id="10" name="Picture 10"/>
             <wp:cNvGraphicFramePr>
@@ -10740,7 +10756,7 @@
                   <pic:spPr>
                     <a:xfrm>
                       <a:off x="0" y="0"/>
-                      <a:ext cx="5040000" cy="9383827"/>
+                      <a:ext cx="5039995" cy="7255720"/>
                     </a:xfrm>
                     <a:prstGeom prst="rect">
                       <a:avLst/>
@@ -10764,7 +10780,7 @@
     </w:p>
     <w:p>
       <w:r>
-        <w:t>如图4 所示, ENCORE 的核心领域对象包括 User / Role / UserRole 三类账号实体, ShowCategory / ShowInfo 两类剧目实体, TheaterHall / HallSeat 两类演出厅实体, ShowSchedule / ScheduleSeat 两类场次实体, TicketOrder / TicketItem 两类订单与票据实体, 以及 PaymentRecord / CheckinRecord 两类辅助记录实体. 状态枚举 ScheduleStatus / SeatStatus / OrderStatus / TicketStatus 与正文及状态图保持一致.</w:t>
+        <w:t>如图4 所示, ENCORE 核心领域对象包括账号 UserAccount (role 单列承载角色), 剧目 ShowEntity, 场馆体系 Venue / VenueHall / SeatLayout / SeatLayoutArea / SeatLayoutSeat / VenueArea, 场次体系 ShowSchedule / ScheduleSeat / ScheduleAreaInventory, 以及订单与票据 TicketOrder / TicketItem, 共 13 个实体。状态枚举 ShowStatus / TicketMode / ScheduleStatus / SeatStatus / OrderStatus / TicketStatus 与正文及状态图保持一致。</w:t>
       </w:r>
     </w:p>
     <w:p>
@@ -10774,7 +10790,7 @@
       <w:r>
         <w:drawing>
           <wp:inline distT="0" distB="0" distL="114300" distR="114300">
-            <wp:extent cx="5039995" cy="7566660"/>
+            <wp:extent cx="4812129" cy="7772400"/>
             <wp:effectExtent l="0" t="0" r="1905" b="2540"/>
             <wp:docPr id="11" name="Picture 11"/>
             <wp:cNvGraphicFramePr>
@@ -10798,7 +10814,7 @@
                   <pic:spPr>
                     <a:xfrm>
                       <a:off x="0" y="0"/>
-                      <a:ext cx="5040000" cy="7566720"/>
+                      <a:ext cx="4812129" cy="7772400"/>
                     </a:xfrm>
                     <a:prstGeom prst="rect">
                       <a:avLst/>
@@ -10822,7 +10838,7 @@
     </w:p>
     <w:p>
       <w:r>
-        <w:t>如图5 所示, ENCORE 在数据库层面定义 15 张核心表支撑购票闭环; 退改、优惠、离线检票缓存等优化功能在详细设计阶段可通过 refund_request、coupon_rule、checkin_sync_queue 等扩展表补充。数据库实体的字段语义与关系说明见表 8。</w:t>
+        <w:t>如图5 所示, ENCORE 在数据库层面由 13 张业务表支撑购票闭环: user_account、encore_show、venue、venue_hall、seat_layout、seat_layout_area、seat_layout_seat、venue_area、show_schedule、schedule_seat、schedule_area_inventory、ticket_order、ticket_item。角色以 user_account.role 单列承载, 支付为内联模拟、检票仅翻转票据状态, 故不设独立支付 / 检票记录表; 公告、优惠等扩展能力可在后续迭代增表补充。数据库实体字段语义见表 8。</w:t>
       </w:r>
     </w:p>
     <w:p>
@@ -12765,7 +12781,7 @@
                 <w:b w:val="0"/>
                 <w:sz w:val="21"/>
               </w:rPr>
-              <w:t>用户账号管理</w:t>
+              <w:t>员工账号管理</w:t>
             </w:r>
           </w:p>
         </w:tc>
@@ -12793,7 +12809,7 @@
                 <w:b w:val="0"/>
                 <w:sz w:val="21"/>
               </w:rPr>
-              <w:t>系统管理员创建、禁用、重置用户账号</w:t>
+              <w:t>系统管理员创建、禁用、重置员工账号 (口令 BCrypt)</w:t>
             </w:r>
           </w:p>
         </w:tc>
@@ -12839,7 +12855,7 @@
                 <w:b w:val="0"/>
                 <w:sz w:val="21"/>
               </w:rPr>
-              <w:t>角色与权限管理</w:t>
+              <w:t>角色分配</w:t>
             </w:r>
           </w:p>
         </w:tc>
@@ -12867,7 +12883,7 @@
                 <w:b w:val="0"/>
                 <w:sz w:val="21"/>
               </w:rPr>
-              <w:t>系统管理员维护角色清单并为用户分配角色</w:t>
+              <w:t>系统管理员为员工账号分配 user / admin / checker / sysadmin 角色 (role 单列)</w:t>
             </w:r>
           </w:p>
         </w:tc>
@@ -12913,7 +12929,7 @@
                 <w:b w:val="0"/>
                 <w:sz w:val="21"/>
               </w:rPr>
-              <w:t>操作日志查看</w:t>
+              <w:t>区域购票 (ZONED/MIXED)</w:t>
             </w:r>
           </w:p>
         </w:tc>
@@ -12927,7 +12943,7 @@
                 <w:b w:val="0"/>
                 <w:sz w:val="21"/>
               </w:rPr>
-              <w:t>ENC_UC_SYS_03</w:t>
+              <w:t>ENC_UC_ORDER_05</w:t>
             </w:r>
           </w:p>
         </w:tc>
@@ -12941,7 +12957,7 @@
                 <w:b w:val="0"/>
                 <w:sz w:val="21"/>
               </w:rPr>
-              <w:t>系统管理员查询关键操作日志并导出</w:t>
+              <w:t>注册用户在 ZONED / MIXED 场次选定区域与张数 (1~4) 购票, 区域库存原子扣减防超卖</w:t>
             </w:r>
           </w:p>
         </w:tc>
@@ -13089,7 +13105,7 @@
                 <w:b w:val="0"/>
                 <w:sz w:val="21"/>
               </w:rPr>
-              <w:t>用户生成可分享的拼座邀请链接 / 二维码, 邀请人进入同场次联合锁座并合并下单</w:t>
+              <w:t>用户生成拼座邀请码, 受邀人加入同场次联合锁座, 发起人合并为一笔订单结算支付</w:t>
             </w:r>
           </w:p>
         </w:tc>
@@ -13163,7 +13179,7 @@
                 <w:b w:val="0"/>
                 <w:sz w:val="21"/>
               </w:rPr>
-              <w:t>首页基于规则 + 协同过滤 + 内容相似度三路混合排序, 个性化推荐 Top 8 演出</w:t>
+              <w:t>首页基于后端规则排序生成全局 Top8 推荐 (在售 / 销量 / 营收 / 权重 / 新近), 对所有用户一致</w:t>
             </w:r>
           </w:p>
         </w:tc>
@@ -13612,80 +13628,10 @@
           </w:p>
         </w:tc>
       </w:tr>
-      <w:tr>
-        <w:tblPrEx>
-          <w:tblBorders>
-            <w:top w:val="single" w:color="000000" w:sz="4" w:space="0"/>
-            <w:left w:val="single" w:color="000000" w:sz="4" w:space="0"/>
-            <w:bottom w:val="single" w:color="000000" w:sz="4" w:space="0"/>
-            <w:right w:val="single" w:color="000000" w:sz="4" w:space="0"/>
-            <w:insideH w:val="single" w:color="000000" w:sz="4" w:space="0"/>
-            <w:insideV w:val="single" w:color="000000" w:sz="4" w:space="0"/>
-          </w:tblBorders>
-          <w:tblCellMar>
-            <w:top w:w="0" w:type="dxa"/>
-            <w:left w:w="108" w:type="dxa"/>
-            <w:bottom w:w="0" w:type="dxa"/>
-            <w:right w:w="108" w:type="dxa"/>
-          </w:tblCellMar>
-        </w:tblPrEx>
-        <w:tc>
-          <w:tcPr>
-            <w:tcW w:w="1617" w:type="dxa"/>
-          </w:tcPr>
-          <w:p>
-            <w:r>
-              <w:rPr>
-                <w:sz w:val="21"/>
-              </w:rPr>
-              <w:t>37</w:t>
-            </w:r>
-          </w:p>
-        </w:tc>
-        <w:tc>
-          <w:tcPr>
-            <w:tcW w:w="1618" w:type="dxa"/>
-          </w:tcPr>
-          <w:p>
-            <w:r>
-              <w:rPr>
-                <w:sz w:val="21"/>
-              </w:rPr>
-              <w:t>AI 运营助手</w:t>
-            </w:r>
-          </w:p>
-        </w:tc>
-        <w:tc>
-          <w:tcPr>
-            <w:tcW w:w="2761" w:type="dxa"/>
-          </w:tcPr>
-          <w:p>
-            <w:r>
-              <w:rPr>
-                <w:sz w:val="21"/>
-              </w:rPr>
-              <w:t>ENC_UC_AI_01</w:t>
-            </w:r>
-          </w:p>
-        </w:tc>
-        <w:tc>
-          <w:tcPr>
-            <w:tcW w:w="2526" w:type="dxa"/>
-          </w:tcPr>
-          <w:p>
-            <w:r>
-              <w:rPr>
-                <w:sz w:val="21"/>
-              </w:rPr>
-              <w:t>票务管理员可生成演出推荐语、公告草稿、售票复盘摘要; 默认使用本地模板与规则, 外部大模型仅作为可选增强。</w:t>
-            </w:r>
-          </w:p>
-        </w:tc>
-      </w:tr>
     </w:tbl>
     <w:p>
       <w:r>
-        <w:t>表 7 中共定义 37 个用例, 覆盖游客、注册用户、票务管理员、检票员、系统管理员等 5 类参与者。其中 9 个核心用例将在 4.3 ~ 4.11 节按模板字段展开详述; 新增的批量排期、退改处理、报表导出、离线检票缓存、优惠策略、AI 运营助手等优化用例用于增强真实剧院运营场景。各参与者对应的 UML 用例图见图6 ~ 图11。</w:t>
+        <w:t>表 7 列出系统用例, 覆盖游客、注册用户、票务管理员、检票员、系统管理员 5 类参与者。其中 4.3 ~ 4.13 共 11 个核心用例按模板字段展开详述 (含区域售票与拼座邀请); 批量排期、退改处理、报表导出、离线检票缓存、优惠策略等为面向真实运营的规划用例。各参与者对应的 UML 用例图见图6 ~ 图11。</w:t>
       </w:r>
     </w:p>
     <w:p>
@@ -13700,7 +13646,7 @@
       <w:r>
         <w:drawing>
           <wp:inline distT="0" distB="0" distL="114300" distR="114300">
-            <wp:extent cx="5039995" cy="17748885"/>
+            <wp:extent cx="5039995" cy="6813472"/>
             <wp:effectExtent l="0" t="0" r="1905" b="5715"/>
             <wp:docPr id="4" name="Picture 4"/>
             <wp:cNvGraphicFramePr>
@@ -13724,7 +13670,7 @@
                   <pic:spPr>
                     <a:xfrm>
                       <a:off x="0" y="0"/>
-                      <a:ext cx="5040000" cy="17749038"/>
+                      <a:ext cx="5039995" cy="6813472"/>
                     </a:xfrm>
                     <a:prstGeom prst="rect">
                       <a:avLst/>
@@ -13758,7 +13704,7 @@
       <w:r>
         <w:drawing>
           <wp:inline distT="0" distB="0" distL="114300" distR="114300">
-            <wp:extent cx="5039995" cy="3668395"/>
+            <wp:extent cx="5039995" cy="3260891"/>
             <wp:effectExtent l="0" t="0" r="1905" b="1905"/>
             <wp:docPr id="5" name="Picture 5"/>
             <wp:cNvGraphicFramePr>
@@ -13782,7 +13728,7 @@
                   <pic:spPr>
                     <a:xfrm>
                       <a:off x="0" y="0"/>
-                      <a:ext cx="5040000" cy="3669016"/>
+                      <a:ext cx="5039995" cy="3260891"/>
                     </a:xfrm>
                     <a:prstGeom prst="rect">
                       <a:avLst/>
@@ -13811,7 +13757,7 @@
       <w:r>
         <w:drawing>
           <wp:inline distT="0" distB="0" distL="114300" distR="114300">
-            <wp:extent cx="5039995" cy="3261360"/>
+            <wp:extent cx="5039995" cy="3992663"/>
             <wp:effectExtent l="0" t="0" r="1905" b="2540"/>
             <wp:docPr id="6" name="Picture 6"/>
             <wp:cNvGraphicFramePr>
@@ -13835,7 +13781,7 @@
                   <pic:spPr>
                     <a:xfrm>
                       <a:off x="0" y="0"/>
-                      <a:ext cx="5040000" cy="3261764"/>
+                      <a:ext cx="5039995" cy="3992663"/>
                     </a:xfrm>
                     <a:prstGeom prst="rect">
                       <a:avLst/>
@@ -13864,7 +13810,7 @@
       <w:r>
         <w:drawing>
           <wp:inline distT="0" distB="0" distL="114300" distR="114300">
-            <wp:extent cx="5039995" cy="6607175"/>
+            <wp:extent cx="5039995" cy="4718887"/>
             <wp:effectExtent l="0" t="0" r="1905" b="9525"/>
             <wp:docPr id="7" name="Picture 7"/>
             <wp:cNvGraphicFramePr>
@@ -13888,7 +13834,7 @@
                   <pic:spPr>
                     <a:xfrm>
                       <a:off x="0" y="0"/>
-                      <a:ext cx="5040000" cy="6607803"/>
+                      <a:ext cx="5039995" cy="4718887"/>
                     </a:xfrm>
                     <a:prstGeom prst="rect">
                       <a:avLst/>
@@ -13917,7 +13863,7 @@
       <w:r>
         <w:drawing>
           <wp:inline distT="0" distB="0" distL="114300" distR="114300">
-            <wp:extent cx="5039995" cy="2569845"/>
+            <wp:extent cx="5039995" cy="2299834"/>
             <wp:effectExtent l="0" t="0" r="1905" b="8255"/>
             <wp:docPr id="8" name="Picture 8"/>
             <wp:cNvGraphicFramePr>
@@ -13941,7 +13887,7 @@
                   <pic:spPr>
                     <a:xfrm>
                       <a:off x="0" y="0"/>
-                      <a:ext cx="5040000" cy="2569972"/>
+                      <a:ext cx="5039995" cy="2299834"/>
                     </a:xfrm>
                     <a:prstGeom prst="rect">
                       <a:avLst/>
@@ -13970,7 +13916,7 @@
       <w:r>
         <w:drawing>
           <wp:inline distT="0" distB="0" distL="114300" distR="114300">
-            <wp:extent cx="5039995" cy="4133215"/>
+            <wp:extent cx="5039995" cy="2649597"/>
             <wp:effectExtent l="0" t="0" r="1905" b="6985"/>
             <wp:docPr id="9" name="Picture 9"/>
             <wp:cNvGraphicFramePr>
@@ -13994,7 +13940,7 @@
                   <pic:spPr>
                     <a:xfrm>
                       <a:off x="0" y="0"/>
-                      <a:ext cx="5040000" cy="4133624"/>
+                      <a:ext cx="5039995" cy="2649597"/>
                     </a:xfrm>
                     <a:prstGeom prst="rect">
                       <a:avLst/>
@@ -14013,7 +13959,7 @@
         <w:jc w:val="center"/>
       </w:pPr>
       <w:r>
-        <w:t>图11  系统管理员权限管理用例图</w:t>
+        <w:t>图11  系统管理员账号管理用例图</w:t>
       </w:r>
     </w:p>
     <w:p>
@@ -14140,7 +14086,7 @@
           </w:tcPr>
           <w:p>
             <w:r>
-              <w:t>sys_user</w:t>
+              <w:t>user_account</w:t>
             </w:r>
           </w:p>
         </w:tc>
@@ -14160,7 +14106,7 @@
           </w:tcPr>
           <w:p>
             <w:r>
-              <w:t>保存用户登录账号、密码哈希、手机号、邮箱、状态等基本信息</w:t>
+              <w:t>账号 id、username、password (BCrypt 哈希)、role 单列角色、display_name、status; 全部角色与登录鉴权的唯一来源</w:t>
             </w:r>
           </w:p>
         </w:tc>
@@ -14188,7 +14134,7 @@
           </w:tcPr>
           <w:p>
             <w:r>
-              <w:t>sys_role</w:t>
+              <w:t>encore_show</w:t>
             </w:r>
           </w:p>
         </w:tc>
@@ -14198,7 +14144,7 @@
           </w:tcPr>
           <w:p>
             <w:r>
-              <w:t>角色字典</w:t>
+              <w:t>剧目信息</w:t>
             </w:r>
           </w:p>
         </w:tc>
@@ -14208,7 +14154,7 @@
           </w:tcPr>
           <w:p>
             <w:r>
-              <w:t>维护游客 / 注册用户 / 票务管理员 / 检票员 / 系统管理员等角色</w:t>
+              <w:t>剧目标题、副标题、海报、简介、时长、分类 category、标签、状态 (ShowStatus)、运营权重 sort_order</w:t>
             </w:r>
           </w:p>
         </w:tc>
@@ -14236,7 +14182,7 @@
           </w:tcPr>
           <w:p>
             <w:r>
-              <w:t>sys_user_role</w:t>
+              <w:t>venue</w:t>
             </w:r>
           </w:p>
         </w:tc>
@@ -14246,7 +14192,7 @@
           </w:tcPr>
           <w:p>
             <w:r>
-              <w:t>用户-角色关联</w:t>
+              <w:t>场馆</w:t>
             </w:r>
           </w:p>
         </w:tc>
@@ -14256,7 +14202,7 @@
           </w:tcPr>
           <w:p>
             <w:r>
-              <w:t>多对多关联表, 实现一个用户可绑定多个角色</w:t>
+              <w:t>剧院 / 剧场场馆的名称、城市、地址与状态</w:t>
             </w:r>
           </w:p>
         </w:tc>
@@ -14284,7 +14230,7 @@
           </w:tcPr>
           <w:p>
             <w:r>
-              <w:t>show_category</w:t>
+              <w:t>venue_hall</w:t>
             </w:r>
           </w:p>
         </w:tc>
@@ -14294,7 +14240,7 @@
           </w:tcPr>
           <w:p>
             <w:r>
-              <w:t>演出分类</w:t>
+              <w:t>演出厅</w:t>
             </w:r>
           </w:p>
         </w:tc>
@@ -14304,7 +14250,7 @@
           </w:tcPr>
           <w:p>
             <w:r>
-              <w:t>音乐剧 / 话剧 / 戏曲 / 综艺 等剧目分类</w:t>
+              <w:t>场馆下演出厅的名称、类型、容量、清场缓冲 clearance_minutes 与默认布局</w:t>
             </w:r>
           </w:p>
         </w:tc>
@@ -14332,7 +14278,7 @@
           </w:tcPr>
           <w:p>
             <w:r>
-              <w:t>show_info</w:t>
+              <w:t>seat_layout</w:t>
             </w:r>
           </w:p>
         </w:tc>
@@ -14342,7 +14288,7 @@
           </w:tcPr>
           <w:p>
             <w:r>
-              <w:t>剧目信息</w:t>
+              <w:t>座位布局</w:t>
             </w:r>
           </w:p>
         </w:tc>
@@ -14352,7 +14298,7 @@
           </w:tcPr>
           <w:p>
             <w:r>
-              <w:t>剧目标题、海报、简介、时长、票价区间、所属分类</w:t>
+              <w:t>演出厅可复用座位布局, 含售票模式 ticket_mode、版本号与状态 (DRAFT / PUBLISHED)</w:t>
             </w:r>
           </w:p>
         </w:tc>
@@ -14380,7 +14326,7 @@
           </w:tcPr>
           <w:p>
             <w:r>
-              <w:t>theater_hall</w:t>
+              <w:t>seat_layout_area</w:t>
             </w:r>
           </w:p>
         </w:tc>
@@ -14390,7 +14336,7 @@
           </w:tcPr>
           <w:p>
             <w:r>
-              <w:t>演出厅</w:t>
+              <w:t>布局区域</w:t>
             </w:r>
           </w:p>
         </w:tc>
@@ -14400,7 +14346,7 @@
           </w:tcPr>
           <w:p>
             <w:r>
-              <w:t>剧院内具体演出厅的名称、行列规模</w:t>
+              <w:t>座位布局内区域划分: 名称、编码、类型、是否对号入座 is_seated、容量与基准票价</w:t>
             </w:r>
           </w:p>
         </w:tc>
@@ -14428,7 +14374,7 @@
           </w:tcPr>
           <w:p>
             <w:r>
-              <w:t>hall_seat</w:t>
+              <w:t>seat_layout_seat</w:t>
             </w:r>
           </w:p>
         </w:tc>
@@ -14438,7 +14384,7 @@
           </w:tcPr>
           <w:p>
             <w:r>
-              <w:t>演出厅座位</w:t>
+              <w:t>布局座位</w:t>
             </w:r>
           </w:p>
         </w:tc>
@@ -14448,7 +14394,7 @@
           </w:tcPr>
           <w:p>
             <w:r>
-              <w:t>演出厅内每个固定座位的行号、列号、区域、是否可售</w:t>
+              <w:t>布局内每个座位的编码、行列、分区、状态与票价, 关联布局区域</w:t>
             </w:r>
           </w:p>
         </w:tc>
@@ -14476,7 +14422,7 @@
           </w:tcPr>
           <w:p>
             <w:r>
-              <w:t>show_schedule</w:t>
+              <w:t>venue_area</w:t>
             </w:r>
           </w:p>
         </w:tc>
@@ -14486,7 +14432,7 @@
           </w:tcPr>
           <w:p>
             <w:r>
-              <w:t>演出场次</w:t>
+              <w:t>场馆区域</w:t>
             </w:r>
           </w:p>
         </w:tc>
@@ -14496,7 +14442,7 @@
           </w:tcPr>
           <w:p>
             <w:r>
-              <w:t>剧目在某演出厅的具体演出时间, 携带 ScheduleStatus 状态</w:t>
+              <w:t>演出厅级售票区域 (ZONED 站票 / 看台) 定义, 维护 available / locked / sold 计数基准</w:t>
             </w:r>
           </w:p>
         </w:tc>
@@ -14524,7 +14470,7 @@
           </w:tcPr>
           <w:p>
             <w:r>
-              <w:t>schedule_seat</w:t>
+              <w:t>show_schedule</w:t>
             </w:r>
           </w:p>
         </w:tc>
@@ -14534,7 +14480,7 @@
           </w:tcPr>
           <w:p>
             <w:r>
-              <w:t>场次座位票池</w:t>
+              <w:t>演出场次</w:t>
             </w:r>
           </w:p>
         </w:tc>
@@ -14544,7 +14490,7 @@
           </w:tcPr>
           <w:p>
             <w:r>
-              <w:t>依据演出厅座位为单一场次生成的可售座位副本, 携带 SeatStatus 状态与票价</w:t>
+              <w:t>剧目在某厅某布局的场次: 开演 / 结束 / 售票时间、状态 (ScheduleStatus)、发布状态、售票模式、票价区间</w:t>
             </w:r>
           </w:p>
         </w:tc>
@@ -14572,7 +14518,7 @@
           </w:tcPr>
           <w:p>
             <w:r>
-              <w:t>ticket_order</w:t>
+              <w:t>schedule_seat</w:t>
             </w:r>
           </w:p>
         </w:tc>
@@ -14582,7 +14528,7 @@
           </w:tcPr>
           <w:p>
             <w:r>
-              <w:t>订单</w:t>
+              <w:t>场次座位票池</w:t>
             </w:r>
           </w:p>
         </w:tc>
@@ -14592,7 +14538,7 @@
           </w:tcPr>
           <w:p>
             <w:r>
-              <w:t>用户购票订单, 携带 OrderStatus 状态、总金额、倒计时过期时间</w:t>
+              <w:t>场次座位副本 (座位码 / 行列 / 分区 / SeatStatus / 票价 / 区域), 售票最小可锁定单元</w:t>
             </w:r>
           </w:p>
         </w:tc>
@@ -14620,7 +14566,7 @@
           </w:tcPr>
           <w:p>
             <w:r>
-              <w:t>ticket_item</w:t>
+              <w:t>schedule_area_inventory</w:t>
             </w:r>
           </w:p>
         </w:tc>
@@ -14630,7 +14576,7 @@
           </w:tcPr>
           <w:p>
             <w:r>
-              <w:t>票据明细</w:t>
+              <w:t>场次区域库存</w:t>
             </w:r>
           </w:p>
         </w:tc>
@@ -14640,7 +14586,7 @@
           </w:tcPr>
           <w:p>
             <w:r>
-              <w:t>支付成功后生成的电子票, 含票号、二维码模拟码、TicketStatus 状态</w:t>
+              <w:t>区域票 total / available / locked / sold 四原子计数 + 票价 + 状态, 经 CAS 更新维护</w:t>
             </w:r>
           </w:p>
         </w:tc>
@@ -14668,7 +14614,7 @@
           </w:tcPr>
           <w:p>
             <w:r>
-              <w:t>payment_record</w:t>
+              <w:t>ticket_order</w:t>
             </w:r>
           </w:p>
         </w:tc>
@@ -14678,7 +14624,7 @@
           </w:tcPr>
           <w:p>
             <w:r>
-              <w:t>支付记录</w:t>
+              <w:t>订单</w:t>
             </w:r>
           </w:p>
         </w:tc>
@@ -14688,7 +14634,7 @@
           </w:tcPr>
           <w:p>
             <w:r>
-              <w:t>记录每次模拟支付的金额、渠道、支付时间</w:t>
+              <w:t>用户订单: 总金额、状态 (OrderStatus)、15 分钟过期 expires_at、支付时间 paid_at</w:t>
             </w:r>
           </w:p>
         </w:tc>
@@ -14716,7 +14662,7 @@
           </w:tcPr>
           <w:p>
             <w:r>
-              <w:t>checkin_record</w:t>
+              <w:t>ticket_item</w:t>
             </w:r>
           </w:p>
         </w:tc>
@@ -14726,7 +14672,7 @@
           </w:tcPr>
           <w:p>
             <w:r>
-              <w:t>检票记录</w:t>
+              <w:t>票据明细</w:t>
             </w:r>
           </w:p>
         </w:tc>
@@ -14736,103 +14682,7 @@
           </w:tcPr>
           <w:p>
             <w:r>
-              <w:t>记录检票员对票据的核销时间, 用于审计与防重复</w:t>
-            </w:r>
-          </w:p>
-        </w:tc>
-      </w:tr>
-      <w:tr>
-        <w:tblPrEx>
-          <w:tblBorders>
-            <w:top w:val="single" w:color="000000" w:sz="4" w:space="0"/>
-            <w:left w:val="single" w:color="000000" w:sz="4" w:space="0"/>
-            <w:bottom w:val="single" w:color="000000" w:sz="4" w:space="0"/>
-            <w:right w:val="single" w:color="000000" w:sz="4" w:space="0"/>
-            <w:insideH w:val="single" w:color="000000" w:sz="4" w:space="0"/>
-            <w:insideV w:val="single" w:color="000000" w:sz="4" w:space="0"/>
-          </w:tblBorders>
-          <w:tblCellMar>
-            <w:top w:w="0" w:type="dxa"/>
-            <w:left w:w="108" w:type="dxa"/>
-            <w:bottom w:w="0" w:type="dxa"/>
-            <w:right w:w="108" w:type="dxa"/>
-          </w:tblCellMar>
-        </w:tblPrEx>
-        <w:tc>
-          <w:tcPr>
-            <w:tcW w:w="2769" w:type="dxa"/>
-          </w:tcPr>
-          <w:p>
-            <w:r>
-              <w:t>announcement</w:t>
-            </w:r>
-          </w:p>
-        </w:tc>
-        <w:tc>
-          <w:tcPr>
-            <w:tcW w:w="2769" w:type="dxa"/>
-          </w:tcPr>
-          <w:p>
-            <w:r>
-              <w:t>公告</w:t>
-            </w:r>
-          </w:p>
-        </w:tc>
-        <w:tc>
-          <w:tcPr>
-            <w:tcW w:w="2769" w:type="dxa"/>
-          </w:tcPr>
-          <w:p>
-            <w:r>
-              <w:t>剧院公告内容、发布时间, 用户端首页展示</w:t>
-            </w:r>
-          </w:p>
-        </w:tc>
-      </w:tr>
-      <w:tr>
-        <w:tblPrEx>
-          <w:tblBorders>
-            <w:top w:val="single" w:color="000000" w:sz="4" w:space="0"/>
-            <w:left w:val="single" w:color="000000" w:sz="4" w:space="0"/>
-            <w:bottom w:val="single" w:color="000000" w:sz="4" w:space="0"/>
-            <w:right w:val="single" w:color="000000" w:sz="4" w:space="0"/>
-            <w:insideH w:val="single" w:color="000000" w:sz="4" w:space="0"/>
-            <w:insideV w:val="single" w:color="000000" w:sz="4" w:space="0"/>
-          </w:tblBorders>
-          <w:tblCellMar>
-            <w:top w:w="0" w:type="dxa"/>
-            <w:left w:w="108" w:type="dxa"/>
-            <w:bottom w:w="0" w:type="dxa"/>
-            <w:right w:w="108" w:type="dxa"/>
-          </w:tblCellMar>
-        </w:tblPrEx>
-        <w:tc>
-          <w:tcPr>
-            <w:tcW w:w="2769" w:type="dxa"/>
-          </w:tcPr>
-          <w:p>
-            <w:r>
-              <w:t>operation_log</w:t>
-            </w:r>
-          </w:p>
-        </w:tc>
-        <w:tc>
-          <w:tcPr>
-            <w:tcW w:w="2769" w:type="dxa"/>
-          </w:tcPr>
-          <w:p>
-            <w:r>
-              <w:t>操作日志</w:t>
-            </w:r>
-          </w:p>
-        </w:tc>
-        <w:tc>
-          <w:tcPr>
-            <w:tcW w:w="2769" w:type="dxa"/>
-          </w:tcPr>
-          <w:p>
-            <w:r>
-              <w:t>管理端关键操作日志, 含操作者、目标、动作、时间</w:t>
+              <w:t>电子票: 票号 ticketCode (全局唯一)、状态 (TicketStatus)、绑定座位 seat_id 或区域库存 area_inventory_id</w:t>
             </w:r>
           </w:p>
         </w:tc>
@@ -14840,7 +14690,7 @@
     </w:tbl>
     <w:p>
       <w:r>
-        <w:t>数据库实体的关系约束: 一个演出分类下含多个剧目; 一个剧目可创建多个演出场次; 一个演出厅含多个固定座位; 一个场次基于演出厅座位生成多个 schedule_seat; 一个订单含一张或多张 ticket_item; 一张 ticket_item 唯一关联一个 schedule_seat 与至多一条 checkin_record.</w:t>
+        <w:t>数据库实体的关系约束: 一个剧目 (encore_show) 可创建多个演出场次 (show_schedule); 一个场馆 (venue) 含多个演出厅 (venue_hall), 一个演出厅可有多个座位布局 (seat_layout), 一个布局含多个区域 (seat_layout_area) 与座位 (seat_layout_seat); 一个场次基于已发布布局快照生成多条 schedule_seat 与 schedule_area_inventory; 一个订单 (ticket_order) 含一张或多张 ticket_item; 一张 ticket_item 唯一关联一个 schedule_seat 或一条区域库存 (schedule_area_inventory).</w:t>
       </w:r>
     </w:p>
     <w:p>
@@ -15015,7 +14865,7 @@
       <w:r>
         <w:drawing>
           <wp:inline distT="0" distB="0" distL="114300" distR="114300">
-            <wp:extent cx="5039995" cy="3397885"/>
+            <wp:extent cx="5039995" cy="3397932"/>
             <wp:effectExtent l="0" t="0" r="1905" b="5715"/>
             <wp:docPr id="12" name="Picture 12"/>
             <wp:cNvGraphicFramePr>
@@ -15039,7 +14889,7 @@
                   <pic:spPr>
                     <a:xfrm>
                       <a:off x="0" y="0"/>
-                      <a:ext cx="5040000" cy="3397935"/>
+                      <a:ext cx="5039995" cy="3397932"/>
                     </a:xfrm>
                     <a:prstGeom prst="rect">
                       <a:avLst/>
@@ -15181,7 +15031,7 @@
           <w:color w:val="0000FF"/>
           <w:sz w:val="24"/>
         </w:rPr>
-        <w:t>●  主成功场景: 1. 用户进入演出列表页; 2. 前端调用 GET /api/show 获取剧目列表; 3. 用户按分类、关键词或时间筛选; 4. 前端调用 GET /api/show/{id} 加载详情; 5. 用户查看场次卡片; 6. 用户点击场次进入选座入口.</w:t>
+        <w:t>●  主成功场景: 1. 用户进入演出列表页; 2. 前端 GET /api/shows 获取剧目列表; 3. 用户按分类、关键词或时间筛选; 4. 前端 GET /api/shows/{id} 加载详情、GET /api/shows/{id}/schedules 加载场次; 5. 用户查看场次卡片; 6. 用户点击场次进入选座 / 区域购票入口。</w:t>
       </w:r>
     </w:p>
     <w:p>
@@ -15341,7 +15191,7 @@
           <w:color w:val="0000FF"/>
           <w:sz w:val="24"/>
         </w:rPr>
-        <w:t>●  主成功场景: 1. 用户进入选座页; 2. 前端 GET /api/schedule/{id}/seats 加载座位图; 3. 用户点击一个或多个 AVAILABLE 座位; 4. 前端 POST /api/schedule/{id}/lock 请求锁定; 5. 后端在 Redis SETNX 加锁并更新 schedule_seat 为 LOCKED; 6. 后端返回锁定成功; 7. 前端跳转至订单确认页.</w:t>
+        <w:t>●  主成功场景: 1. 用户进入选座页; 2. 前端 GET /api/schedules/{id}/seats 加载座位 (区域票则 GET /api/schedules/{id}/areas); 3. 用户点击一个或多个 AVAILABLE 座位; 4. 前端 POST /api/schedules/{id}/seats/lock 请求锁定; 5. 后端 Redis SETNX 加锁 (不写库, LOCKED 为运行时叠加) 并经 SeatStatusPublisher 广播; 6. 返回锁定成功; 7. 前端进入下单确认页。</w:t>
       </w:r>
     </w:p>
     <w:p>
@@ -15377,7 +15227,7 @@
           <w:color w:val="0000FF"/>
           <w:sz w:val="24"/>
         </w:rPr>
-        <w:t>●  技术和数据变元表: 单次最多锁定 6 个座位; 座位状态: AVAILABLE / LOCKED / SOLD / DISABLED; 锁键格式: schedule:{id}:seat:{seatId}.</w:t>
+        <w:t>●  技术和数据变元表: 单次最多锁定 6 个座位; 座位状态 AVAILABLE / LOCKED / SOLD / DISABLED; 锁键 encore:seat-lock:{scheduleId}:{seatCode}, TTL 15 分钟; 区域购票每单 1~4 张。</w:t>
       </w:r>
     </w:p>
     <w:p/>
@@ -15393,7 +15243,7 @@
       <w:r>
         <w:drawing>
           <wp:inline distT="0" distB="0" distL="114300" distR="114300">
-            <wp:extent cx="5039995" cy="8819515"/>
+            <wp:extent cx="5039995" cy="6807951"/>
             <wp:effectExtent l="0" t="0" r="1905" b="6985"/>
             <wp:docPr id="13" name="Picture 13"/>
             <wp:cNvGraphicFramePr>
@@ -15417,7 +15267,7 @@
                   <pic:spPr>
                     <a:xfrm>
                       <a:off x="0" y="0"/>
-                      <a:ext cx="5040000" cy="8820001"/>
+                      <a:ext cx="5039995" cy="6807951"/>
                     </a:xfrm>
                     <a:prstGeom prst="rect">
                       <a:avLst/>
@@ -15446,7 +15296,7 @@
       <w:r>
         <w:drawing>
           <wp:inline distT="0" distB="0" distL="114300" distR="114300">
-            <wp:extent cx="5039995" cy="4587240"/>
+            <wp:extent cx="5039995" cy="5264887"/>
             <wp:effectExtent l="0" t="0" r="1905" b="10160"/>
             <wp:docPr id="14" name="Picture 14"/>
             <wp:cNvGraphicFramePr>
@@ -15470,7 +15320,7 @@
                   <pic:spPr>
                     <a:xfrm>
                       <a:off x="0" y="0"/>
-                      <a:ext cx="5040000" cy="4587465"/>
+                      <a:ext cx="5039995" cy="5264887"/>
                     </a:xfrm>
                     <a:prstGeom prst="rect">
                       <a:avLst/>
@@ -15499,7 +15349,7 @@
       <w:r>
         <w:drawing>
           <wp:inline distT="0" distB="0" distL="114300" distR="114300">
-            <wp:extent cx="5039995" cy="5288915"/>
+            <wp:extent cx="5039995" cy="3669470"/>
             <wp:effectExtent l="0" t="0" r="1905" b="6985"/>
             <wp:docPr id="15" name="Picture 15"/>
             <wp:cNvGraphicFramePr>
@@ -15523,7 +15373,7 @@
                   <pic:spPr>
                     <a:xfrm>
                       <a:off x="0" y="0"/>
-                      <a:ext cx="5040000" cy="5289290"/>
+                      <a:ext cx="5039995" cy="3669470"/>
                     </a:xfrm>
                     <a:prstGeom prst="rect">
                       <a:avLst/>
@@ -15555,7 +15405,7 @@
         <w:pStyle w:val="25"/>
       </w:pPr>
       <w:r>
-        <w:t>实时多人选座广播: 同一场次的多名在线用户通过 WebSocket / STOMP 协议订阅 /topic/schedule/{id}/seat 主题, 任一用户的锁座 / 释放动作经后端 WebSocketBroadcaster 在 P95 ≤ 200ms 内秒级推送给所有订阅者, 屏幕端无需轮询即可同步显示, 完整时序如图16 所示.</w:t>
+        <w:t>实时多人选座广播: 同一场次的多名在线用户通过 WebSocket / STOMP 订阅 /topic/schedules/{id}/seats 主题, 任一用户的锁座 / 释放 / 售出经后端 SeatStatusPublisher 在 P95 ≤ 200ms 内推送给所有订阅者, 屏幕端无需轮询即可同步显示, 完整时序如图16 所示。</w:t>
       </w:r>
     </w:p>
     <w:p>
@@ -15565,7 +15415,7 @@
       <w:r>
         <w:drawing>
           <wp:inline distT="0" distB="0" distL="114300" distR="114300">
-            <wp:extent cx="5039995" cy="5050155"/>
+            <wp:extent cx="5039995" cy="5021029"/>
             <wp:effectExtent l="0" t="0" r="1905" b="4445"/>
             <wp:docPr id="16" name="Picture 16"/>
             <wp:cNvGraphicFramePr>
@@ -15589,7 +15439,7 @@
                   <pic:spPr>
                     <a:xfrm>
                       <a:off x="0" y="0"/>
-                      <a:ext cx="5040000" cy="5050511"/>
+                      <a:ext cx="5039995" cy="5021029"/>
                     </a:xfrm>
                     <a:prstGeom prst="rect">
                       <a:avLst/>
@@ -15616,7 +15466,7 @@
         <w:pStyle w:val="25"/>
       </w:pPr>
       <w:r>
-        <w:t>舞台视角预览 (ENC_UC_SEAT_02): 选座页用户点击具体座位时, 浮层基于 three.js + WebGL 渲染剧院 3D 场景, 以该座位为 PerspectiveCamera 的位置展示"从这个座位看向舞台"的视野预览, 帧率目标 ≥ 30 FPS, 首屏加载 ≤ 3 秒, 组件结构如图17 所示.</w:t>
+        <w:t>舞台视角预览 (ENC_UC_SEAT_02): 选座页用户点击具体座位时, 浮层基于 three.js + WebGL 原生渲染剧院 3D 场景, 以该座位为 PerspectiveCamera 位置展示从该座位看向舞台的视野 (经 Raycaster 拾取、程序化几何), 帧率 ≥ 30 FPS, 首屏加载 ≤ 3 秒, WebGL 不可用时降级, 组件结构如图17 所示。</w:t>
       </w:r>
     </w:p>
     <w:p>
@@ -15626,7 +15476,7 @@
       <w:r>
         <w:drawing>
           <wp:inline distT="0" distB="0" distL="114300" distR="114300">
-            <wp:extent cx="5039995" cy="3751580"/>
+            <wp:extent cx="5039995" cy="2270432"/>
             <wp:effectExtent l="0" t="0" r="1905" b="7620"/>
             <wp:docPr id="17" name="Picture 17"/>
             <wp:cNvGraphicFramePr>
@@ -15650,7 +15500,7 @@
                   <pic:spPr>
                     <a:xfrm>
                       <a:off x="0" y="0"/>
-                      <a:ext cx="5040000" cy="3751837"/>
+                      <a:ext cx="5039995" cy="2270432"/>
                     </a:xfrm>
                     <a:prstGeom prst="rect">
                       <a:avLst/>
@@ -15677,7 +15527,7 @@
         <w:pStyle w:val="25"/>
       </w:pPr>
       <w:r>
-        <w:t>拼座邀请 (ENC_UC_SEAT_03): 用户选择 1~6 个座位并锁定后, 可生成一段 TTL = 10 分钟的拼座邀请链接 / 二维码 (含 scheduleId + 已锁 seatIds 的签名 token); 被邀请人扫码或点击链接进入同场次, 系统将其加入同一 Redis 锁集合并合并为一笔订单, 任一参与者支付即代表整组生效; 邀请超时或参与者主动退出则各自锁释放.</w:t>
+        <w:t>拼座邀请 (ENC_UC_SEAT_03): 用户发起拼座后系统生成邀请码 g-xxxx, 以 owner=group:{inviteCode} 锁定其座位 (Redis 会话 encore:group-order:{inviteCode}, TTL 15 分钟); 受邀人凭邀请码加入同场次联合锁座, 发起人结算 (checkout) 合并为一笔订单后支付; 邀请超时、成员退出或发起人取消则相应座位锁释放。详见 4.13 节与图31。</w:t>
       </w:r>
     </w:p>
     <w:p>
@@ -15776,7 +15626,7 @@
           <w:color w:val="0000FF"/>
           <w:sz w:val="24"/>
         </w:rPr>
-        <w:t>●  前置条件: 用户已成功锁定 1~6 个座位, Redis 锁键归属本用户.</w:t>
+        <w:t>●  前置条件: SEATED 场次已锁定 1~6 个座位且锁归属本用户; 或 ZONED 场次已选定区域与张数 (1~4)。</w:t>
       </w:r>
     </w:p>
     <w:p>
@@ -15800,7 +15650,7 @@
           <w:color w:val="0000FF"/>
           <w:sz w:val="24"/>
         </w:rPr>
-        <w:t>●  主成功场景: 1. 用户在订单确认页核对座位、金额; 2. 用户点击 "提交订单"; 3. 前端 POST /api/order; 4. 后端校验 Redis 锁归属与有效期; 5. 后端在 MySQL 写入 ticket_order; 6. 后端在 Redis 写入 order:{id}:expire 倒计时; 7. 后端返回订单 ID; 8. 前端跳转支付页.</w:t>
+        <w:t>●  主成功场景: 1. 用户在订单确认页核对座位 / 区域与金额; 2. 用户点击「提交订单」; 3. 前端 POST /api/orders; 4. 后端校验场次在售与座位锁归属 (区域票校验余量); 5. 写入 ticket_order (PENDING_PAYMENT, expiresAt = now + 15 分钟) 与 RESERVED 票据 (即时生成 ticketCode); 6. 座位锁值改写为 orderId / 区域库存 lockInventory 原子扣减; 7. 返回订单 ID; 8. 前端跳转支付页。</w:t>
       </w:r>
     </w:p>
     <w:p>
@@ -15812,7 +15662,7 @@
           <w:color w:val="0000FF"/>
           <w:sz w:val="24"/>
         </w:rPr>
-        <w:t>●  扩展（或替代流程）: 4a. Redis 锁不存在 / 已过期 / 不属于该用户: 后端返回 412, 前端提示重新选座. 5a. 数据库写入失败: 后端回滚 Redis 锁并返回 500.</w:t>
+        <w:t>●  扩展（或替代流程）: 4a. 座位锁不存在 / 已过期 / 不属于该用户: 返回 409, 提示重新选座; 4b. 区域余票不足: lockInventory 影响行数为 0, 返回 409; 5a. 数据库写入失败: 事务回滚并经同步钩子释放 Redis 锁, 返回 500。</w:t>
       </w:r>
     </w:p>
     <w:p>
@@ -15836,7 +15686,7 @@
           <w:color w:val="0000FF"/>
           <w:sz w:val="24"/>
         </w:rPr>
-        <w:t>●  技术和数据变元表: 订单 ID: 雪花算法生成; 订单金额 = Σ(scheduleSeat.price); 倒计时 TTL: 15 分钟可由后台配置.</w:t>
+        <w:t>●  技术和数据变元表: 订单 ID = ord-&lt;uuid 前 16 位&gt;; 金额 = Σ 座位 / 区域单价 × 张数; 倒计时 15 分钟, 由 expiresAt 列 + @Scheduled 定时任务回收; 同场次同选座的重复提交幂等返回原订单。</w:t>
       </w:r>
     </w:p>
     <w:p/>
@@ -15852,7 +15702,7 @@
       <w:r>
         <w:drawing>
           <wp:inline distT="0" distB="0" distL="114300" distR="114300">
-            <wp:extent cx="5039995" cy="3479165"/>
+            <wp:extent cx="5039995" cy="4203796"/>
             <wp:effectExtent l="0" t="0" r="1905" b="635"/>
             <wp:docPr id="18" name="Picture 18"/>
             <wp:cNvGraphicFramePr>
@@ -15876,7 +15726,7 @@
                   <pic:spPr>
                     <a:xfrm>
                       <a:off x="0" y="0"/>
-                      <a:ext cx="5040000" cy="3479783"/>
+                      <a:ext cx="5039995" cy="4203796"/>
                     </a:xfrm>
                     <a:prstGeom prst="rect">
                       <a:avLst/>
@@ -15905,7 +15755,7 @@
       <w:r>
         <w:drawing>
           <wp:inline distT="0" distB="0" distL="114300" distR="114300">
-            <wp:extent cx="5039995" cy="4860925"/>
+            <wp:extent cx="5039995" cy="3652077"/>
             <wp:effectExtent l="0" t="0" r="1905" b="3175"/>
             <wp:docPr id="19" name="Picture 19"/>
             <wp:cNvGraphicFramePr>
@@ -15929,7 +15779,7 @@
                   <pic:spPr>
                     <a:xfrm>
                       <a:off x="0" y="0"/>
-                      <a:ext cx="5040000" cy="4861217"/>
+                      <a:ext cx="5039995" cy="3652077"/>
                     </a:xfrm>
                     <a:prstGeom prst="rect">
                       <a:avLst/>
@@ -16059,7 +15909,7 @@
           <w:color w:val="0000FF"/>
           <w:sz w:val="24"/>
         </w:rPr>
-        <w:t>●  后置条件: 订单状态 PAID, 关联座位 SOLD, 系统生成 ticket_item (UNUSED) 与 payment_record.</w:t>
+        <w:t>●  后置条件: 订单状态 PAID; SEATED 座位置 SOLD、ZONED 区域库存 sold 累加; 票据由 RESERVED 翻转为 UNUSED (无 payment_record 表)。</w:t>
       </w:r>
     </w:p>
     <w:p>
@@ -16071,7 +15921,7 @@
           <w:color w:val="0000FF"/>
           <w:sz w:val="24"/>
         </w:rPr>
-        <w:t>●  主成功场景: 1. 用户进入支付页; 2. 用户点击 "模拟支付"; 3. 前端 POST /api/payment/mock; 4. 后端校验订单状态与倒计时; 5. 后端写入 payment_record; 6. 后端更新 ticket_order 为 PAID 并将 schedule_seat 置为 SOLD; 7. 后端批量生成 ticket_item; 8. 后端返回票号列表; 9. 前端跳转 "我的电子票".</w:t>
+        <w:t>●  主成功场景: 1. 用户进入支付页; 2. 点击「模拟支付」; 3. 前端 POST /api/orders/{id}/pay; 4. 后端校验订单归属与是否过期 (已 PAID 则幂等返回); 5. ZONED 经 sellInventory 原子扣减、SEATED 校验座位锁并置 SOLD; 6. 票据 RESERVED → UNUSED, 订单置 PAID; 7. 释放座位锁并广播 SOLD / AREA_SOLD, publish ORDER_PAID 刷新看板; 8. 前端跳转「我的电子票」。</w:t>
       </w:r>
     </w:p>
     <w:p>
@@ -16083,7 +15933,7 @@
           <w:color w:val="0000FF"/>
           <w:sz w:val="24"/>
         </w:rPr>
-        <w:t>●  扩展（或替代流程）: 4a. 订单已过期: 后端将订单置为 EXPIRED, 释放座位, 返回 408 "订单已超时". 6a. 数据库异常: 通过事务回滚, 订单与座位状态保持不变, 返回 500.</w:t>
+        <w:t>●  扩展（或替代流程）: 4a. 订单已过期 / 非待支付: 标记 EXPIRED 并返回失败, 提示重新下单; 5a. 区域 sellInventory 影响行数为 0 或座位状态已变: 回滚并返回失败 / 409。</w:t>
       </w:r>
     </w:p>
     <w:p>
@@ -16095,7 +15945,7 @@
           <w:color w:val="0000FF"/>
           <w:sz w:val="24"/>
         </w:rPr>
-        <w:t>●  特殊需求: 支付环节为模拟实现, 不接入真实支付通道; 票号须全局唯一; 支付成功推送可用于看板实时刷新.</w:t>
+        <w:t>●  特殊需求: 支付为模拟实现, 不接入真实支付通道; 票号 ticketCode 在下单时生成并全局唯一; 支付成功 publish 事件用于看板实时刷新。</w:t>
       </w:r>
     </w:p>
     <w:p>
@@ -16107,7 +15957,7 @@
           <w:color w:val="0000FF"/>
           <w:sz w:val="24"/>
         </w:rPr>
-        <w:t>●  技术和数据变元表: 票号 = 雪花 ID; 二维码模拟码 = ticketCode + HMAC 签名 (后续扩展); 支持的支付渠道: "MOCK" 单一值.</w:t>
+        <w:t>●  技术和数据变元表: 票号 ticketCode = T + base36(时间戳) + 序号; 二维码为后续扩展; 支付渠道固定 MOCK, 不接入真实资金通道。</w:t>
       </w:r>
     </w:p>
     <w:p/>
@@ -16123,7 +15973,7 @@
       <w:r>
         <w:drawing>
           <wp:inline distT="0" distB="0" distL="114300" distR="114300">
-            <wp:extent cx="5039995" cy="5659755"/>
+            <wp:extent cx="5039995" cy="7597729"/>
             <wp:effectExtent l="0" t="0" r="1905" b="4445"/>
             <wp:docPr id="20" name="Picture 20"/>
             <wp:cNvGraphicFramePr>
@@ -16147,7 +15997,7 @@
                   <pic:spPr>
                     <a:xfrm>
                       <a:off x="0" y="0"/>
-                      <a:ext cx="5040000" cy="5659971"/>
+                      <a:ext cx="5039995" cy="7597729"/>
                     </a:xfrm>
                     <a:prstGeom prst="rect">
                       <a:avLst/>
@@ -16176,7 +16026,7 @@
       <w:r>
         <w:drawing>
           <wp:inline distT="0" distB="0" distL="114300" distR="114300">
-            <wp:extent cx="5039995" cy="4118610"/>
+            <wp:extent cx="5039995" cy="5637133"/>
             <wp:effectExtent l="0" t="0" r="1905" b="8890"/>
             <wp:docPr id="21" name="Picture 21"/>
             <wp:cNvGraphicFramePr>
@@ -16200,7 +16050,7 @@
                   <pic:spPr>
                     <a:xfrm>
                       <a:off x="0" y="0"/>
-                      <a:ext cx="5040000" cy="4119111"/>
+                      <a:ext cx="5039995" cy="5637133"/>
                     </a:xfrm>
                     <a:prstGeom prst="rect">
                       <a:avLst/>
@@ -16229,7 +16079,7 @@
       <w:r>
         <w:drawing>
           <wp:inline distT="0" distB="0" distL="114300" distR="114300">
-            <wp:extent cx="5039995" cy="3451860"/>
+            <wp:extent cx="5039995" cy="3658810"/>
             <wp:effectExtent l="0" t="0" r="1905" b="2540"/>
             <wp:docPr id="22" name="Picture 22"/>
             <wp:cNvGraphicFramePr>
@@ -16253,7 +16103,7 @@
                   <pic:spPr>
                     <a:xfrm>
                       <a:off x="0" y="0"/>
-                      <a:ext cx="5040000" cy="3452400"/>
+                      <a:ext cx="5039995" cy="3658810"/>
                     </a:xfrm>
                     <a:prstGeom prst="rect">
                       <a:avLst/>
@@ -16383,7 +16233,7 @@
           <w:color w:val="0000FF"/>
           <w:sz w:val="24"/>
         </w:rPr>
-        <w:t>●  后置条件: 票据状态 CHECKED_IN, 写入 checkin_record 记录, 允许用户入场.</w:t>
+        <w:t>●  后置条件: 票据状态 UNUSED → CHECKED_IN (无 checkin_record 表), publish TICKET_CHECKED_IN 刷新看板, 允许用户入场。</w:t>
       </w:r>
     </w:p>
     <w:p>
@@ -16395,7 +16245,7 @@
           <w:color w:val="0000FF"/>
           <w:sz w:val="24"/>
         </w:rPr>
-        <w:t>●  主成功场景: 1. 检票员登录检票端; 2. 扫描二维码模拟码或手动输入票号; 3. 前端 POST /api/checkin/verify; 4. 后端查询 ticket_item; 5. 后端校验票据状态、场次时间; 6. 后端将票据置为 CHECKED_IN 并写入 checkin_record; 7. 前端展示核销成功与座位号.</w:t>
+        <w:t>●  主成功场景: 1. 检票员 (checker / admin / sysadmin) 登录检票端; 2. 扫描或手动输入票号; 3. 前端 POST /api/checkin/verify; 4. 后端按 ticketCode 查票并校验所属订单为 PAID; 5. 校验票据为 UNUSED、场次未取消且处于检票窗口; 6. 将票据翻转为 CHECKED_IN; 7. 前端展示核销结果与座位 / 区域信息。</w:t>
       </w:r>
     </w:p>
     <w:p>
@@ -16407,7 +16257,7 @@
           <w:color w:val="0000FF"/>
           <w:sz w:val="24"/>
         </w:rPr>
-        <w:t>●  扩展（或替代流程）: 4a. 票据不存在: 后端返回 404. 5a. 票据已 CHECKED_IN: 返回 409 "重复检票". 5b. 票据 INVALID 或 REFUNDED: 返回 409 异常. 5c. 当前时间不在场次的允许检票窗口内: 返回 425 "非当前场次".</w:t>
+        <w:t>●  扩展（或替代流程）: 4a. 票码不存在: 返回 404; 4b. 订单非 PAID: 返回 409; 5a. 票据已 CHECKED_IN: 返回 409 重复检票; 5b. 票据状态非 UNUSED (RESERVED / VOID): 返回 409; 5c. 票据不属于当前检票场次或不在检票窗口: 返回 409。</w:t>
       </w:r>
     </w:p>
     <w:p>
@@ -16431,7 +16281,7 @@
           <w:color w:val="0000FF"/>
           <w:sz w:val="24"/>
         </w:rPr>
-        <w:t>●  技术和数据变元表: 允许检票窗口: 开场前 60 分钟至开场后 30 分钟; 检票员需要 CHECKIN 角色权限.</w:t>
+        <w:t>●  技术和数据变元表: 允许检票窗口 = 开演前 2 小时至演出结束; 检票角色 = checker / admin / sysadmin; 另有 GET /api/checkin/schedules 列出可检票场次。</w:t>
       </w:r>
     </w:p>
     <w:p/>
@@ -16447,7 +16297,7 @@
       <w:r>
         <w:drawing>
           <wp:inline distT="0" distB="0" distL="114300" distR="114300">
-            <wp:extent cx="5039995" cy="3517265"/>
+            <wp:extent cx="3824956" cy="7772400"/>
             <wp:effectExtent l="0" t="0" r="1905" b="635"/>
             <wp:docPr id="23" name="Picture 23"/>
             <wp:cNvGraphicFramePr>
@@ -16471,7 +16321,7 @@
                   <pic:spPr>
                     <a:xfrm>
                       <a:off x="0" y="0"/>
-                      <a:ext cx="5040000" cy="3517377"/>
+                      <a:ext cx="3824956" cy="7772400"/>
                     </a:xfrm>
                     <a:prstGeom prst="rect">
                       <a:avLst/>
@@ -16500,7 +16350,7 @@
       <w:r>
         <w:drawing>
           <wp:inline distT="0" distB="0" distL="114300" distR="114300">
-            <wp:extent cx="5039995" cy="4259580"/>
+            <wp:extent cx="5039995" cy="4861330"/>
             <wp:effectExtent l="0" t="0" r="1905" b="7620"/>
             <wp:docPr id="24" name="Picture 24"/>
             <wp:cNvGraphicFramePr>
@@ -16524,7 +16374,7 @@
                   <pic:spPr>
                     <a:xfrm>
                       <a:off x="0" y="0"/>
-                      <a:ext cx="5040000" cy="4260210"/>
+                      <a:ext cx="5039995" cy="4861330"/>
                     </a:xfrm>
                     <a:prstGeom prst="rect">
                       <a:avLst/>
@@ -16666,7 +16516,7 @@
           <w:color w:val="0000FF"/>
           <w:sz w:val="24"/>
         </w:rPr>
-        <w:t>●  主成功场景: 1. 管理员维护演出分类与剧目档案; 2. 管理员维护演出厅与座位布局; 3. 管理员为剧目创建场次, 选择演出厅与开演时间; 4. 系统依据演出厅座位生成 schedule_seat (全部 AVAILABLE); 5. 管理员设置场次票价分区; 6. 审核通过后将场次状态 DRAFT 改为 ON_SALE.</w:t>
+        <w:t>●  主成功场景: 1. 管理员维护剧目档案 (分类为剧目字段); 2. 维护场馆 venue、演出厅 venue_hall 与座位布局 seat_layout 并发布布局; 3. 为剧目创建场次, 绑定厅 / 布局、开演时间与售票模式; 4. 系统快照布局生成 schedule_seat 与 schedule_area_inventory; 5. 校验同厅时间冲突 (清场缓冲); 6. 发布并将场次置为 ON_SALE。</w:t>
       </w:r>
     </w:p>
     <w:p>
@@ -16678,7 +16528,7 @@
           <w:color w:val="0000FF"/>
           <w:sz w:val="24"/>
         </w:rPr>
-        <w:t>●  扩展（或替代流程）: 2a. 座位布局不完整: 系统拒绝生成票池并提示完善布局. 3a. 同一演出厅时间冲突: 系统拒绝创建场次. 6a. 场次销售结束后: 自动置为 FINISHED.</w:t>
+        <w:t>●  扩展（或替代流程）: 2a. 布局未发布 / 不完整: 拒绝快照并提示完善; 3a. 同厅时间冲突: 拒绝创建场次; 6a. 售罄或演出结束: 自动置为 SOLD_OUT / ENDED。</w:t>
       </w:r>
     </w:p>
     <w:p>
@@ -16702,7 +16552,7 @@
           <w:color w:val="0000FF"/>
           <w:sz w:val="24"/>
         </w:rPr>
-        <w:t>●  技术和数据变元表: 场次状态: DRAFT / ON_SALE / STOP_SALE / FINISHED / CANCELLED; 票价精度: 元两位小数.</w:t>
+        <w:t>●  技术和数据变元表: 场次状态 ScheduleStatus = DRAFT / PUBLISHED / COMING_SOON / PREPARING / ON_SALE / SOLD_OUT / CANCELLED / ENDED; 售票模式 = SEATED / ZONED / MIXED; 票价精度 DECIMAL(10,2)。</w:t>
       </w:r>
     </w:p>
     <w:p/>
@@ -16718,7 +16568,7 @@
       <w:r>
         <w:drawing>
           <wp:inline distT="0" distB="0" distL="114300" distR="114300">
-            <wp:extent cx="5039995" cy="8519160"/>
+            <wp:extent cx="4302281" cy="7772400"/>
             <wp:effectExtent l="0" t="0" r="1905" b="2540"/>
             <wp:docPr id="25" name="Picture 25"/>
             <wp:cNvGraphicFramePr>
@@ -16742,7 +16592,7 @@
                   <pic:spPr>
                     <a:xfrm>
                       <a:off x="0" y="0"/>
-                      <a:ext cx="5040000" cy="8519775"/>
+                      <a:ext cx="4302281" cy="7772400"/>
                     </a:xfrm>
                     <a:prstGeom prst="rect">
                       <a:avLst/>
@@ -16872,7 +16722,7 @@
           <w:color w:val="0000FF"/>
           <w:sz w:val="24"/>
         </w:rPr>
-        <w:t>●  后置条件: 看板中展示当日订单数、当日销售额、近 7 日票房趋势、热门演出、场次上座率等关键指标.</w:t>
+        <w:t>●  后置条件: 看板展示当日订单数、当日销售额、近 7 日票房趋势、Top5 热门演出、检票汇总等关键指标。</w:t>
       </w:r>
     </w:p>
     <w:p>
@@ -16884,7 +16734,7 @@
           <w:color w:val="0000FF"/>
           <w:sz w:val="24"/>
         </w:rPr>
-        <w:t>●  主成功场景: 1. 管理员打开数据看板页; 2. 前端 GET /api/stat/dashboard; 3. 后端聚合 ticket_order、ticket_item、show_schedule; 4. 后端返回 DashboardVO; 5. 前端使用 ECharts 渲染折线、柱状、饼图.</w:t>
+        <w:t>●  主成功场景: 1. 管理员打开数据看板页; 2. 前端 GET /api/admin/dashboard; 3. AdminService 在应用层内存聚合 ticket_order、ticket_item、encore_show、show_schedule; 4. 返回 DashboardResponse; 5. 前端用 ECharts 渲染折线 + 柱状 (双轴) 与 Top5 横向柱。</w:t>
       </w:r>
     </w:p>
     <w:p>
@@ -16920,7 +16770,7 @@
           <w:color w:val="0000FF"/>
           <w:sz w:val="24"/>
         </w:rPr>
-        <w:t>●  技术和数据变元表: 时间范围: 今日 / 近 7 日 / 近 30 日; 折线点数: ≤ 30; 排行榜大小: 10 条.</w:t>
+        <w:t>●  技术和数据变元表: 时间范围 近 7 日趋势; 折线点数 ≤ 7; 排行榜 Top5; 刷新经 /topic/admin/dashboard 事件信号 + 前端主动重拉。</w:t>
       </w:r>
     </w:p>
     <w:p/>
@@ -16936,7 +16786,7 @@
       <w:r>
         <w:drawing>
           <wp:inline distT="0" distB="0" distL="114300" distR="114300">
-            <wp:extent cx="5039995" cy="4067810"/>
+            <wp:extent cx="5039995" cy="4116386"/>
             <wp:effectExtent l="0" t="0" r="1905" b="8890"/>
             <wp:docPr id="26" name="Picture 26"/>
             <wp:cNvGraphicFramePr>
@@ -16960,7 +16810,7 @@
                   <pic:spPr>
                     <a:xfrm>
                       <a:off x="0" y="0"/>
-                      <a:ext cx="5040000" cy="4068000"/>
+                      <a:ext cx="5039995" cy="4116386"/>
                     </a:xfrm>
                     <a:prstGeom prst="rect">
                       <a:avLst/>
@@ -16984,39 +16834,39 @@
     </w:p>
     <w:p>
       <w:r>
-        <w:t>在 ENC_UC_STAT_01 主成功场景之上, ENCORE 票务管理系统将管理端数据看板按"黑金指挥中心"风格实现, 不止呈现数据, 更让数据本身具有视觉冲击力. 看板架构与关键数据流如图27 所示:</w:t>
-      </w:r>
-    </w:p>
-    <w:p>
-      <w:pPr>
-        <w:pStyle w:val="25"/>
-      </w:pPr>
-      <w:r>
-        <w:t>视觉规范: 全黑底 (#0F0F0F) + 暗红 (#5B0E0E) + 金色 (#C8A35E) 高亮的深色 BI 视觉语言, 自定义 ECharts dark-encore 主题; 整体观感类似机场塔台 / 监控指挥中心, 与用户端沉浸式剧院风格遥相呼应.</w:t>
-      </w:r>
-    </w:p>
-    <w:p>
-      <w:pPr>
-        <w:pStyle w:val="25"/>
-      </w:pPr>
-      <w:r>
-        <w:t>高密度图表: 在传统折线 / 饼图之外, 新增 ECharts Sankey 漏斗 (浏览→选座→下单→支付, 单图表现完整转化链路)、座位区域 Heatmap (按演出厅平面坐标叠加上座率热度)、Bar Race (热门演出 Top 10 时间序列动画).</w:t>
-      </w:r>
-    </w:p>
-    <w:p>
-      <w:pPr>
-        <w:pStyle w:val="25"/>
-      </w:pPr>
-      <w:r>
-        <w:t>实时刷新: 后端 WebSocketBroadcaster 在用户完成支付 / 检票核销时, 通过 /topic/stat/refresh 主题推送轻量事件, 看板局部刷新关键卡片, 避免对 /api/stat/dashboard 进行高频轮询.</w:t>
-      </w:r>
-    </w:p>
-    <w:p>
-      <w:pPr>
-        <w:pStyle w:val="25"/>
-      </w:pPr>
-      <w:r>
-        <w:t>缓存与回源: StatAggregator 优先读取 Redis (TTL 60 秒) 命中缓存; 未命中则回源 MySQL 复杂聚合 SQL (含 GROUP BY hall_id / area / day 等), 命中率 ≥ 80% 时单次看板加载 P95 ≤ 2.5 秒.</w:t>
+        <w:t>在 ENC_UC_STAT_01 主成功场景之上, ENCORE 管理端数据看板采用深色底 + 金色高亮的 BI 视觉风格, 看板架构与关键数据流如图27 所示:</w:t>
+      </w:r>
+    </w:p>
+    <w:p>
+      <w:pPr>
+        <w:pStyle w:val="25"/>
+      </w:pPr>
+      <w:r>
+        <w:t>视觉规范: 深色底 + 金色 (#C8955A) 高亮、灰阶坐标 (#8A8480) 的 ECharts 风格, 与用户端沉浸式剧院风格呼应。</w:t>
+      </w:r>
+    </w:p>
+    <w:p>
+      <w:pPr>
+        <w:pStyle w:val="25"/>
+      </w:pPr>
+      <w:r>
+        <w:t>图表构成: 营收 / 订单 / 售票 / 检票 KPI 数字卡, 近 7 日票房与销量折线 + 柱状双轴图, Top5 热门演出横向柱, 检票汇总卡 (当期为折线 + 柱状, 暂未含 Sankey / 饼图 / 热力图)。</w:t>
+      </w:r>
+    </w:p>
+    <w:p>
+      <w:pPr>
+        <w:pStyle w:val="25"/>
+      </w:pPr>
+      <w:r>
+        <w:t>实时刷新: 下单 / 支付 / 检票事件触发 DashboardRefreshPublisher 向 /topic/admin/dashboard 推送轻量信号, 前端收到后主动重拉看板数据, 避免高频轮询。</w:t>
+      </w:r>
+    </w:p>
+    <w:p>
+      <w:pPr>
+        <w:pStyle w:val="25"/>
+      </w:pPr>
+      <w:r>
+        <w:t>数据聚合: 看板指标由 AdminService 在应用层内存聚合 (stream / groupingBy) 完成, 未引入 Redis 看板缓存与离线数仓; 数据规模增大后可优化为聚合 SQL 或缓存。</w:t>
       </w:r>
     </w:p>
     <w:p>
@@ -17026,7 +16876,7 @@
       <w:r>
         <w:drawing>
           <wp:inline distT="0" distB="0" distL="114300" distR="114300">
-            <wp:extent cx="5039995" cy="2638425"/>
+            <wp:extent cx="5039995" cy="2577903"/>
             <wp:effectExtent l="0" t="0" r="1905" b="3175"/>
             <wp:docPr id="27" name="Picture 27"/>
             <wp:cNvGraphicFramePr>
@@ -17050,7 +16900,7 @@
                   <pic:spPr>
                     <a:xfrm>
                       <a:off x="0" y="0"/>
-                      <a:ext cx="5040000" cy="2638931"/>
+                      <a:ext cx="5039995" cy="2577903"/>
                     </a:xfrm>
                     <a:prstGeom prst="rect">
                       <a:avLst/>
@@ -17180,7 +17030,7 @@
           <w:color w:val="0000FF"/>
           <w:sz w:val="24"/>
         </w:rPr>
-        <w:t>●  后置条件: 首页"猜你喜欢"位返回 Top 8 推荐演出列表, 注册用户与游客分别走个性化路径或冷启动路径, 推荐结果带相关性分数与命中策略标签.</w:t>
+        <w:t>●  后置条件: 首页猜你喜欢位返回全局 Top8 推荐演出列表, 对所有用户一致 (非个性化), 附热度展示分数。</w:t>
       </w:r>
     </w:p>
     <w:p>
@@ -17192,7 +17042,7 @@
           <w:color w:val="0000FF"/>
           <w:sz w:val="24"/>
         </w:rPr>
-        <w:t>●  主成功场景: 1. 用户进入首页或推荐 Tab; 2. 前端 GET /api/rec?userId=&amp;size=8; 3. RecController 接收请求; 4. 候选生成 (Recall): 近 30 日热门 Top 50 + 用户浏览/购买分类同类热门 Top 50, 合并去重为候选池 (~80 项); 5. 三路打分 (Ranking): 协同过滤 (用户-演出共现矩阵 + 余弦相似度) + 内容过滤 (分类标签 + 时长 + 票价区间相似度) + 规则打分 (开场临近度 + 上座率 + 售罄稀缺度), 加权 0.4 / 0.3 / 0.3; 6. 排序取 Top 8; 7. 写入 recommendation:user:{id} Redis 缓存 (TTL 10 分钟); 8. 返回 RecommendVO, 前端首页"猜你喜欢"位渲染. 完整流程如图28 所示.</w:t>
+        <w:t>●  主成功场景: 1. 用户进入首页或推荐位; 2. 前端 GET /api/shows/recommendations/top8; 3. ShowService.listTopRecommendations 载入 PUBLISHED 演出及其场次 / 票务统计; 4. 按 recommendationComparator 排序 (在售优先 &gt; 累计销量 &gt; 累计营收 &gt; 运营权重 sortOrder &gt; 新近 createdAt); 5. 计算 hotScore = 销量×100 + 可售场次×10 + 营收 用于热度展示; 6. 截取前 8 个返回; 7. 前端首页渲染。完整流程如图28 所示。</w:t>
       </w:r>
     </w:p>
     <w:p>
@@ -17204,7 +17054,7 @@
           <w:color w:val="0000FF"/>
           <w:sz w:val="24"/>
         </w:rPr>
-        <w:t>●  扩展（或替代流程）: 4a. 候选池为空 (新剧院冷启动): 直接走规则兜底取近 30 日热门 Top 8. 5a. 注册用户但行为不足 (用户冷启动): 关闭协同过滤路, 权重重分配为内容 0.5 / 规则 0.5. 7a. Redis 写入失败: 仍同步返回结果, 异步重试.</w:t>
+        <w:t>●  扩展（或替代流程）: 4a. 暂无 PUBLISHED 演出: 返回空列表, 前端显示空状态; 4b. 多演出统计并列: 按比较器后续键稳定定序。</w:t>
       </w:r>
     </w:p>
     <w:p>
@@ -17216,7 +17066,7 @@
           <w:color w:val="0000FF"/>
           <w:sz w:val="24"/>
         </w:rPr>
-        <w:t>●  特殊需求: 推荐接口 P95 ≤ 1.5 秒; 协同过滤共现矩阵每日凌晨增量计算; 规则权重支持后台热配置.</w:t>
+        <w:t>●  特殊需求: 推荐接口 P95 ≤ 1.5 秒; 排序在应用层完成, 不依赖离线计算; 运营权重 sortOrder 可后台调整。</w:t>
       </w:r>
     </w:p>
     <w:p>
@@ -17228,7 +17078,7 @@
           <w:color w:val="0000FF"/>
           <w:sz w:val="24"/>
         </w:rPr>
-        <w:t>●  技术和数据变元表: 推荐 size: 默认 8, 上限 30; Redis 缓存 key: recommendation:user:{userId}, 匿名用户使用 IP 哈希; 后续扩展: 接入向量数据库 + 用户画像 Embedding (本期不实现).</w:t>
+        <w:t>●  技术和数据变元表: 固定返回 Top8, 全局统一结果, 无按用户缓存; 比较器键: 在售 / 销量 / 营收 / sortOrder / createdAt; 后续路线: 引入用户行为召回与个性化排序 (本期不实现)。</w:t>
       </w:r>
     </w:p>
     <w:p/>
@@ -17244,7 +17094,7 @@
       <w:r>
         <w:drawing>
           <wp:inline distT="0" distB="0" distL="114300" distR="114300">
-            <wp:extent cx="5039995" cy="7865745"/>
+            <wp:extent cx="5039995" cy="6868146"/>
             <wp:effectExtent l="0" t="0" r="1905" b="8255"/>
             <wp:docPr id="28" name="Picture 28"/>
             <wp:cNvGraphicFramePr>
@@ -17268,7 +17118,7 @@
                   <pic:spPr>
                     <a:xfrm>
                       <a:off x="0" y="0"/>
-                      <a:ext cx="5040000" cy="7865975"/>
+                      <a:ext cx="5039995" cy="6868146"/>
                     </a:xfrm>
                     <a:prstGeom prst="rect">
                       <a:avLst/>
@@ -17287,7 +17137,7 @@
         <w:jc w:val="center"/>
       </w:pPr>
       <w:r>
-        <w:t>图28  AI 演出智能推荐流程图</w:t>
+        <w:t>图28  演出推荐 Top8 生成流程图</w:t>
       </w:r>
     </w:p>
     <w:p>
@@ -17295,7 +17145,7 @@
         <w:rPr>
           <w:sz w:val="24"/>
         </w:rPr>
-        <w:t>AI 功能成本控制: ENCORE 不把付费大模型调用放入购票、下单、检票等必需链路。推荐结果优先由本地规则、协同过滤和内容相似度计算生成; AI 运营助手默认使用可缓存的提示词模板与本地规则生成摘要, 仅在配置 API Key 且超过演示评分需要时调用外部模型。</w:t>
+        <w:t>演出推荐完全由后端本地规则排序生成, 不调用任何外部大模型, 也不进入购票、下单、检票等必需链路, 因此无外部 API 成本与额度风险。</w:t>
       </w:r>
     </w:p>
     <w:p>
@@ -17303,7 +17153,313 @@
         <w:rPr>
           <w:sz w:val="24"/>
         </w:rPr>
-        <w:t>外部模型降级策略: 当外部模型额度耗尽、网络不可用或响应超时时, 系统自动降级为本地模板文案和规则推荐, 不影响用户购票、管理员排期、检票核销和数据看板。</w:t>
+        <w:t>若未来引入个性化或运营辅助能力, 将采用本地优先、外部可选的降级策略: 外部服务不可用时自动回退本地规则与模板, 不影响用户购票、管理员排期、检票核销与数据看板。</w:t>
+      </w:r>
+    </w:p>
+    <w:p>
+      <w:pPr>
+        <w:pStyle w:val="3"/>
+      </w:pPr>
+      <w:r>
+        <w:t>区域购票（ENC_UC_ORDER_05）</w:t>
+      </w:r>
+    </w:p>
+    <w:p>
+      <w:pPr>
+        <w:pStyle w:val="25"/>
+      </w:pPr>
+      <w:r>
+        <w:t>●  用例名称: 区域购票 (ZONED / MIXED)</w:t>
+      </w:r>
+    </w:p>
+    <w:p>
+      <w:pPr>
+        <w:pStyle w:val="25"/>
+      </w:pPr>
+      <w:r>
+        <w:t>●  范围: 系统用例</w:t>
+      </w:r>
+    </w:p>
+    <w:p>
+      <w:pPr>
+        <w:pStyle w:val="25"/>
+      </w:pPr>
+      <w:r>
+        <w:t>●  级别: 用户目标级别</w:t>
+      </w:r>
+    </w:p>
+    <w:p>
+      <w:pPr>
+        <w:pStyle w:val="25"/>
+      </w:pPr>
+      <w:r>
+        <w:t>●  主要角色: 注册用户</w:t>
+      </w:r>
+    </w:p>
+    <w:p>
+      <w:pPr>
+        <w:pStyle w:val="25"/>
+      </w:pPr>
+      <w:r>
+        <w:t>●  涉众: 注册用户: 期望对站票 / 看台等非对号区域快速选区购票; 票务管理员: 期望区域库存准确、不超卖; 剧院: 期望提升非对号区域的售卖效率.</w:t>
+      </w:r>
+    </w:p>
+    <w:p>
+      <w:pPr>
+        <w:pStyle w:val="25"/>
+      </w:pPr>
+      <w:r>
+        <w:t>●  前置条件: 用户已登录; 目标场次售票模式为 ZONED 或 MIXED 且处于 ON_SALE; 目标区域 schedule_area_inventory 状态为 AVAILABLE.</w:t>
+      </w:r>
+    </w:p>
+    <w:p>
+      <w:pPr>
+        <w:pStyle w:val="25"/>
+      </w:pPr>
+      <w:r>
+        <w:t>●  后置条件: 区域库存 locked 增加对应张数; 生成 PENDING_PAYMENT 订单与等量 RESERVED 票据 (seatId 为空, 绑定 areaInventoryId); 支付后 locked 转 sold、票据转 UNUSED.</w:t>
+      </w:r>
+    </w:p>
+    <w:p>
+      <w:pPr>
+        <w:pStyle w:val="25"/>
+      </w:pPr>
+      <w:r>
+        <w:t>●  主成功场景: 1. 用户打开区域售票场次; 2. 前端 GET /api/schedules/{id}/areas 加载区域 (price / total / available / locked / sold / status); 3. 用户选择区域与张数 (1~4); 4. 前端 POST /api/orders {scheduleId, areaInventoryId, quantity}; 5. 后端校验在售、张数与区域归属; 6. lockInventory 原子扣减 (available-=q, locked+=q); 7. 写入订单与 RESERVED 票据并 publish AREA_LOCKED; 8. 返回订单 ID, 前端跳转支付页.</w:t>
+      </w:r>
+    </w:p>
+    <w:p>
+      <w:pPr>
+        <w:pStyle w:val="25"/>
+      </w:pPr>
+      <w:r>
+        <w:t>●  扩展（或替代流程）: 3a. 张数超出 1~4: 返回 400; 5a. 已存在相同待支付区域订单: 幂等返回原订单; 6a. 区域余票不足 (lockInventory 影响行数 0): 返回 409 区域余票不足; 支付 5b. sellInventory 影响行数 0: 回滚并返回失败.</w:t>
+      </w:r>
+    </w:p>
+    <w:p>
+      <w:pPr>
+        <w:pStyle w:val="25"/>
+      </w:pPr>
+      <w:r>
+        <w:t>●  特殊需求: 库存四原子计数 (total / available / locked / sold) 经 WHERE 余量 ≥ q 的 CAS 更新维护, 防并发超卖; 区域票不锁定具体座位.</w:t>
+      </w:r>
+    </w:p>
+    <w:p>
+      <w:pPr>
+        <w:pStyle w:val="25"/>
+      </w:pPr>
+      <w:r>
+        <w:t>●  技术和数据变元表: 售票模式 ZONED / MIXED; 每单 1~4 张; 倒计时 15 分钟; 票号 ticketCode 下单即生成; MIXED 中对号区按 schedule_seat 计数、纯站票区按 schedule_area_inventory 计数. 完整下单与支付时序见图30.</w:t>
+      </w:r>
+    </w:p>
+    <w:p>
+      <w:pPr/>
+    </w:p>
+    <w:p>
+      <w:pPr/>
+      <w:r>
+        <w:t>区域购票的下单与支付时序见图30.</w:t>
+      </w:r>
+    </w:p>
+    <w:p>
+      <w:pPr>
+        <w:jc w:val="center"/>
+      </w:pPr>
+      <w:r>
+        <w:drawing>
+          <wp:inline xmlns:a="http://schemas.openxmlformats.org/drawingml/2006/main" xmlns:pic="http://schemas.openxmlformats.org/drawingml/2006/picture">
+            <wp:extent cx="5039995" cy="6089277"/>
+            <wp:docPr id="30" name="Picture 30"/>
+            <wp:cNvGraphicFramePr>
+              <a:graphicFrameLocks noChangeAspect="1"/>
+            </wp:cNvGraphicFramePr>
+            <a:graphic>
+              <a:graphicData uri="http://schemas.openxmlformats.org/drawingml/2006/picture">
+                <pic:pic>
+                  <pic:nvPicPr>
+                    <pic:cNvPr id="0" name="figure-30.png"/>
+                    <pic:cNvPicPr/>
+                  </pic:nvPicPr>
+                  <pic:blipFill>
+                    <a:blip r:embed="rId48"/>
+                    <a:stretch>
+                      <a:fillRect/>
+                    </a:stretch>
+                  </pic:blipFill>
+                  <pic:spPr>
+                    <a:xfrm>
+                      <a:off x="0" y="0"/>
+                      <a:ext cx="5039995" cy="6089277"/>
+                    </a:xfrm>
+                    <a:prstGeom prst="rect"/>
+                  </pic:spPr>
+                </pic:pic>
+              </a:graphicData>
+            </a:graphic>
+          </wp:inline>
+        </w:drawing>
+      </w:r>
+    </w:p>
+    <w:p>
+      <w:pPr>
+        <w:pStyle w:val="40"/>
+        <w:jc w:val="center"/>
+      </w:pPr>
+      <w:r>
+        <w:t>图30  区域售票 (ZONED/MIXED) 下单顺序图</w:t>
+      </w:r>
+    </w:p>
+    <w:p>
+      <w:pPr>
+        <w:pStyle w:val="3"/>
+      </w:pPr>
+      <w:r>
+        <w:t>拼座邀请（ENC_UC_SEAT_03）</w:t>
+      </w:r>
+    </w:p>
+    <w:p>
+      <w:pPr>
+        <w:pStyle w:val="25"/>
+      </w:pPr>
+      <w:r>
+        <w:t>●  用例名称: 拼座邀请协作下单</w:t>
+      </w:r>
+    </w:p>
+    <w:p>
+      <w:pPr>
+        <w:pStyle w:val="25"/>
+      </w:pPr>
+      <w:r>
+        <w:t>●  范围: 系统用例</w:t>
+      </w:r>
+    </w:p>
+    <w:p>
+      <w:pPr>
+        <w:pStyle w:val="25"/>
+      </w:pPr>
+      <w:r>
+        <w:t>●  级别: 用户目标级别</w:t>
+      </w:r>
+    </w:p>
+    <w:p>
+      <w:pPr>
+        <w:pStyle w:val="25"/>
+      </w:pPr>
+      <w:r>
+        <w:t>●  主要角色: 注册用户 (发起人 / 受邀成员)</w:t>
+      </w:r>
+    </w:p>
+    <w:p>
+      <w:pPr>
+        <w:pStyle w:val="25"/>
+      </w:pPr>
+      <w:r>
+        <w:t>●  涉众: 发起人: 期望与好友选定相邻座位合并支付; 受邀成员: 期望凭邀请码快速加入同场次锁座; 票务管理员: 期望拼座锁与个人锁互斥、超时可回收.</w:t>
+      </w:r>
+    </w:p>
+    <w:p>
+      <w:pPr>
+        <w:pStyle w:val="25"/>
+      </w:pPr>
+      <w:r>
+        <w:t>●  前置条件: 各参与者均已登录; 同一 SEATED 场次处于 ON_SALE; 目标座位为 AVAILABLE.</w:t>
+      </w:r>
+    </w:p>
+    <w:p>
+      <w:pPr>
+        <w:pStyle w:val="25"/>
+      </w:pPr>
+      <w:r>
+        <w:t>●  后置条件: 拼座座位以 owner=group:{inviteCode} 锁定 (Redis 会话 encore:group-order:{inviteCode}, TTL 15 分钟); 结算后合并为一笔订单, 锁 owner 转 orderId.</w:t>
+      </w:r>
+    </w:p>
+    <w:p>
+      <w:pPr>
+        <w:pStyle w:val="25"/>
+      </w:pPr>
+      <w:r>
+        <w:t>●  主成功场景: 1. 发起人 POST /api/group-orders {scheduleId, seatIds} 生成邀请码 g-xxxx; 2. 系统以 group 锁锁定座位并广播 LOCKED; 3. 受邀成员 GET /api/group-orders/{inviteCode} 查看, POST /{inviteCode}/join 加入并联合锁座; 4. 发起人 POST /{inviteCode}/checkout 校验群锁有效后合并下单得 orderId; 5. 发起人 POST /api/orders/{orderId}/pay 支付 (沿用图21).</w:t>
+      </w:r>
+    </w:p>
+    <w:p>
+      <w:pPr>
+        <w:pStyle w:val="25"/>
+      </w:pPr>
+      <w:r>
+        <w:t>●  扩展（或替代流程）: 3a. 座位已被他人认领: 返回 409; 3b. 总座位数超过 6: 返回 400; 成员退出 DELETE /{inviteCode}/members/me (发起人不可退出); 取消 DELETE /{inviteCode} (仅发起人, 释放全部锁, 会话 CANCELLED); 超时未结算: 定时任务回收锁与会话并广播 GROUP_RELEASED.</w:t>
+      </w:r>
+    </w:p>
+    <w:p>
+      <w:pPr>
+        <w:pStyle w:val="25"/>
+      </w:pPr>
+      <w:r>
+        <w:t>●  特殊需求: 拼座座位锁 owner=group:{inviteCode} 与个人锁互斥; 会话与座位锁均 15 分钟 TTL, 超时自动回收; 单笔拼座最多 6 个座位.</w:t>
+      </w:r>
+    </w:p>
+    <w:p>
+      <w:pPr>
+        <w:pStyle w:val="25"/>
+      </w:pPr>
+      <w:r>
+        <w:t>●  技术和数据变元表: 邀请码 inviteCode = g + 10 位十六进制; Redis 会话 encore:group-order:{inviteCode} 状态 OPEN / CHECKED_OUT / CANCELLED; 座位锁键 encore:seat-lock:{scheduleId}:{seatCode}. 完整协作时序见图31.</w:t>
+      </w:r>
+    </w:p>
+    <w:p>
+      <w:pPr/>
+    </w:p>
+    <w:p>
+      <w:pPr/>
+      <w:r>
+        <w:t>拼座邀请的发起、加入与结算时序见图31.</w:t>
+      </w:r>
+    </w:p>
+    <w:p>
+      <w:pPr>
+        <w:jc w:val="center"/>
+      </w:pPr>
+      <w:r>
+        <w:drawing>
+          <wp:inline xmlns:a="http://schemas.openxmlformats.org/drawingml/2006/main" xmlns:pic="http://schemas.openxmlformats.org/drawingml/2006/picture">
+            <wp:extent cx="5039995" cy="3938415"/>
+            <wp:docPr id="31" name="Picture 31"/>
+            <wp:cNvGraphicFramePr>
+              <a:graphicFrameLocks noChangeAspect="1"/>
+            </wp:cNvGraphicFramePr>
+            <a:graphic>
+              <a:graphicData uri="http://schemas.openxmlformats.org/drawingml/2006/picture">
+                <pic:pic>
+                  <pic:nvPicPr>
+                    <pic:cNvPr id="0" name="figure-31.png"/>
+                    <pic:cNvPicPr/>
+                  </pic:nvPicPr>
+                  <pic:blipFill>
+                    <a:blip r:embed="rId49"/>
+                    <a:stretch>
+                      <a:fillRect/>
+                    </a:stretch>
+                  </pic:blipFill>
+                  <pic:spPr>
+                    <a:xfrm>
+                      <a:off x="0" y="0"/>
+                      <a:ext cx="5039995" cy="3938415"/>
+                    </a:xfrm>
+                    <a:prstGeom prst="rect"/>
+                  </pic:spPr>
+                </pic:pic>
+              </a:graphicData>
+            </a:graphic>
+          </wp:inline>
+        </w:drawing>
+      </w:r>
+    </w:p>
+    <w:p>
+      <w:pPr>
+        <w:pStyle w:val="40"/>
+        <w:jc w:val="center"/>
+      </w:pPr>
+      <w:r>
+        <w:t>图31  拼座邀请协作下单顺序图</w:t>
       </w:r>
     </w:p>
     <w:p>
@@ -17373,7 +17529,7 @@
         <w:pStyle w:val="25"/>
       </w:pPr>
       <w:r>
-        <w:t>管理端数据看板黑金指挥中心风格: 数据看板模块单独采用全黑底 (#0F0F0F) + 暗红 (#5B0E0E) + 金色 (#C8A35E) 高亮的深色 BI 视觉语言, 自定义 ECharts dark-encore 主题, 集成 Sankey 漏斗、座位区域热力图、Bar Race 等高密度图表, 整体观感类似机场塔台 / 监控指挥中心.</w:t>
+        <w:t>管理端数据看板深色风格: 数据看板模块采用深色底 + 金色 (#C8955A) 高亮、灰阶坐标 (#8A8480) 的 ECharts 深色 BI 视觉语言 (dark-encore 主题), 集成营收 / 订单 / 售票 / 检票 KPI 卡、近 7 日票房折线 + 柱状双轴图与 Top5 热门演出横向柱, 与用户端沉浸式剧院风格呼应.</w:t>
       </w:r>
     </w:p>
     <w:p>
@@ -17423,15 +17579,15 @@
         <w:pStyle w:val="25"/>
       </w:pPr>
       <w:r>
-        <w:t>鉴权接口: 通过 Sa-Token 颁发与校验, 请求头携带 Authorization: Bearer &lt;token&gt;; 不使用 JWT (技术栈一致性).</w:t>
-      </w:r>
-    </w:p>
-    <w:p>
-      <w:pPr>
-        <w:pStyle w:val="25"/>
-      </w:pPr>
-      <w:r>
-        <w:t>WebSocket 实时通道: 用户端 / 管理端通过 Spring WebSocket + STOMP 协议建立长连接 (/ws 端点), 后端 simp messaging 模板向 /topic/** 主题广播事件 (选座状态变更、看板局部刷新), 向 /user/queue/** 投递单播结果; 详细消息规约见表 9.</w:t>
+        <w:t>●  鉴权接口: 通过 Sa-Token 颁发与校验, 登录后请求头携带 encore-token: &lt;token&gt; (非 Authorization: Bearer); 由中央 SaInterceptor 统一拦截 /** 校验, 不使用 JWT。</w:t>
+      </w:r>
+    </w:p>
+    <w:p>
+      <w:pPr>
+        <w:pStyle w:val="25"/>
+      </w:pPr>
+      <w:r>
+        <w:t>●  WebSocket 实时通道: 用户端 / 管理端通过 Spring WebSocket + STOMP 建立长连接 (/ws 端点, 原生 WebSocket 无 SockJS), 后端经 SimpMessagingTemplate 向 /topic/schedules/{id}/seats、/topic/admin/dashboard 广播事件 (座位 / 区域状态变更、看板刷新信号); 详细消息规约见表 9。</w:t>
       </w:r>
     </w:p>
     <w:p>
@@ -17632,17 +17788,17 @@
           </w:tcPr>
           <w:p>
             <w:r>
-              <w:t>Authorization: Bearer &lt;token&gt;</w:t>
-            </w:r>
-          </w:p>
-        </w:tc>
-        <w:tc>
-          <w:tcPr>
-            <w:tcW w:w="2076" w:type="dxa"/>
-          </w:tcPr>
-          <w:p>
-            <w:r>
-              <w:t>建立 STOMP 连接, 携带 Sa-Token 鉴权</w:t>
+              <w:t>CONNECT 帧 (无 Authorization 头)</w:t>
+            </w:r>
+          </w:p>
+        </w:tc>
+        <w:tc>
+          <w:tcPr>
+            <w:tcW w:w="2076" w:type="dxa"/>
+          </w:tcPr>
+          <w:p>
+            <w:r>
+              <w:t>建立原生 WebSocket + STOMP 长连接 (/ws 端点); 实时通道不鉴权, 令牌仅用于 REST 接口</w:t>
             </w:r>
           </w:p>
         </w:tc>
@@ -17670,37 +17826,37 @@
           </w:tcPr>
           <w:p>
             <w:r>
-              <w:t>/app/seat/lock</w:t>
-            </w:r>
-          </w:p>
-        </w:tc>
-        <w:tc>
-          <w:tcPr>
-            <w:tcW w:w="2076" w:type="dxa"/>
-          </w:tcPr>
-          <w:p>
-            <w:r>
-              <w:t>客户端 → 服务端</w:t>
-            </w:r>
-          </w:p>
-        </w:tc>
-        <w:tc>
-          <w:tcPr>
-            <w:tcW w:w="2076" w:type="dxa"/>
-          </w:tcPr>
-          <w:p>
-            <w:r>
-              <w:t>{scheduleId, seatIds:[..]}</w:t>
-            </w:r>
-          </w:p>
-        </w:tc>
-        <w:tc>
-          <w:tcPr>
-            <w:tcW w:w="2076" w:type="dxa"/>
-          </w:tcPr>
-          <w:p>
-            <w:r>
-              <w:t>请求锁定一组座位</w:t>
+              <w:t>/topic/schedules/{id}/seats</w:t>
+            </w:r>
+          </w:p>
+        </w:tc>
+        <w:tc>
+          <w:tcPr>
+            <w:tcW w:w="2076" w:type="dxa"/>
+          </w:tcPr>
+          <w:p>
+            <w:r>
+              <w:t>服务端 → 全部订阅者</w:t>
+            </w:r>
+          </w:p>
+        </w:tc>
+        <w:tc>
+          <w:tcPr>
+            <w:tcW w:w="2076" w:type="dxa"/>
+          </w:tcPr>
+          <w:p>
+            <w:r>
+              <w:t>{scheduleId, reason, seats:[{seatId,status}], areas?:[{areaId,available,locked,sold}]}</w:t>
+            </w:r>
+          </w:p>
+        </w:tc>
+        <w:tc>
+          <w:tcPr>
+            <w:tcW w:w="2076" w:type="dxa"/>
+          </w:tcPr>
+          <w:p>
+            <w:r>
+              <w:t>任一用户锁座 / 释放 / 售出或区域库存变更时广播, P95 ≤ 200ms</w:t>
             </w:r>
           </w:p>
         </w:tc>
@@ -17728,37 +17884,37 @@
           </w:tcPr>
           <w:p>
             <w:r>
-              <w:t>/topic/schedule/{id}/seat</w:t>
-            </w:r>
-          </w:p>
-        </w:tc>
-        <w:tc>
-          <w:tcPr>
-            <w:tcW w:w="2076" w:type="dxa"/>
-          </w:tcPr>
-          <w:p>
-            <w:r>
-              <w:t>服务端 → 全部订阅者</w:t>
-            </w:r>
-          </w:p>
-        </w:tc>
-        <w:tc>
-          <w:tcPr>
-            <w:tcW w:w="2076" w:type="dxa"/>
-          </w:tcPr>
-          <w:p>
-            <w:r>
-              <w:t>{seatId, status:LOCKED|AVAILABLE|SOLD, by}</w:t>
-            </w:r>
-          </w:p>
-        </w:tc>
-        <w:tc>
-          <w:tcPr>
-            <w:tcW w:w="2076" w:type="dxa"/>
-          </w:tcPr>
-          <w:p>
-            <w:r>
-              <w:t>任一用户锁座 / 释放 / 支付成功时广播, P95 ≤ 200ms</w:t>
+              <w:t>/topic/admin/dashboard</w:t>
+            </w:r>
+          </w:p>
+        </w:tc>
+        <w:tc>
+          <w:tcPr>
+            <w:tcW w:w="2076" w:type="dxa"/>
+          </w:tcPr>
+          <w:p>
+            <w:r>
+              <w:t>服务端 → 看板订阅者</w:t>
+            </w:r>
+          </w:p>
+        </w:tc>
+        <w:tc>
+          <w:tcPr>
+            <w:tcW w:w="2076" w:type="dxa"/>
+          </w:tcPr>
+          <w:p>
+            <w:r>
+              <w:t>{reason, referenceId, timestamp}</w:t>
+            </w:r>
+          </w:p>
+        </w:tc>
+        <w:tc>
+          <w:tcPr>
+            <w:tcW w:w="2076" w:type="dxa"/>
+          </w:tcPr>
+          <w:p>
+            <w:r>
+              <w:t>看板局部刷新触发, 避免高频轮询</w:t>
             </w:r>
           </w:p>
         </w:tc>
@@ -17786,122 +17942,6 @@
           </w:tcPr>
           <w:p>
             <w:r>
-              <w:t>/user/queue/lock-result</w:t>
-            </w:r>
-          </w:p>
-        </w:tc>
-        <w:tc>
-          <w:tcPr>
-            <w:tcW w:w="2076" w:type="dxa"/>
-          </w:tcPr>
-          <w:p>
-            <w:r>
-              <w:t>服务端 → 单一用户</w:t>
-            </w:r>
-          </w:p>
-        </w:tc>
-        <w:tc>
-          <w:tcPr>
-            <w:tcW w:w="2076" w:type="dxa"/>
-          </w:tcPr>
-          <w:p>
-            <w:r>
-              <w:t>{success, failedSeats:[..]}</w:t>
-            </w:r>
-          </w:p>
-        </w:tc>
-        <w:tc>
-          <w:tcPr>
-            <w:tcW w:w="2076" w:type="dxa"/>
-          </w:tcPr>
-          <w:p>
-            <w:r>
-              <w:t>锁定请求的私有结果回执</w:t>
-            </w:r>
-          </w:p>
-        </w:tc>
-      </w:tr>
-      <w:tr>
-        <w:tblPrEx>
-          <w:tblBorders>
-            <w:top w:val="single" w:color="000000" w:sz="4" w:space="0"/>
-            <w:left w:val="single" w:color="000000" w:sz="4" w:space="0"/>
-            <w:bottom w:val="single" w:color="000000" w:sz="4" w:space="0"/>
-            <w:right w:val="single" w:color="000000" w:sz="4" w:space="0"/>
-            <w:insideH w:val="single" w:color="000000" w:sz="4" w:space="0"/>
-            <w:insideV w:val="single" w:color="000000" w:sz="4" w:space="0"/>
-          </w:tblBorders>
-          <w:tblCellMar>
-            <w:top w:w="0" w:type="dxa"/>
-            <w:left w:w="108" w:type="dxa"/>
-            <w:bottom w:w="0" w:type="dxa"/>
-            <w:right w:w="108" w:type="dxa"/>
-          </w:tblCellMar>
-        </w:tblPrEx>
-        <w:tc>
-          <w:tcPr>
-            <w:tcW w:w="2076" w:type="dxa"/>
-          </w:tcPr>
-          <w:p>
-            <w:r>
-              <w:t>/topic/stat/refresh</w:t>
-            </w:r>
-          </w:p>
-        </w:tc>
-        <w:tc>
-          <w:tcPr>
-            <w:tcW w:w="2076" w:type="dxa"/>
-          </w:tcPr>
-          <w:p>
-            <w:r>
-              <w:t>服务端 → 看板订阅者</w:t>
-            </w:r>
-          </w:p>
-        </w:tc>
-        <w:tc>
-          <w:tcPr>
-            <w:tcW w:w="2076" w:type="dxa"/>
-          </w:tcPr>
-          <w:p>
-            <w:r>
-              <w:t>{type:ORDER_PAID|CHECKIN, payload}</w:t>
-            </w:r>
-          </w:p>
-        </w:tc>
-        <w:tc>
-          <w:tcPr>
-            <w:tcW w:w="2076" w:type="dxa"/>
-          </w:tcPr>
-          <w:p>
-            <w:r>
-              <w:t>看板局部刷新触发, 避免高频轮询</w:t>
-            </w:r>
-          </w:p>
-        </w:tc>
-      </w:tr>
-      <w:tr>
-        <w:tblPrEx>
-          <w:tblBorders>
-            <w:top w:val="single" w:color="000000" w:sz="4" w:space="0"/>
-            <w:left w:val="single" w:color="000000" w:sz="4" w:space="0"/>
-            <w:bottom w:val="single" w:color="000000" w:sz="4" w:space="0"/>
-            <w:right w:val="single" w:color="000000" w:sz="4" w:space="0"/>
-            <w:insideH w:val="single" w:color="000000" w:sz="4" w:space="0"/>
-            <w:insideV w:val="single" w:color="000000" w:sz="4" w:space="0"/>
-          </w:tblBorders>
-          <w:tblCellMar>
-            <w:top w:w="0" w:type="dxa"/>
-            <w:left w:w="108" w:type="dxa"/>
-            <w:bottom w:w="0" w:type="dxa"/>
-            <w:right w:w="108" w:type="dxa"/>
-          </w:tblCellMar>
-        </w:tblPrEx>
-        <w:tc>
-          <w:tcPr>
-            <w:tcW w:w="2076" w:type="dxa"/>
-          </w:tcPr>
-          <w:p>
-            <w:r>
               <w:t>heartbeat / reconnect</w:t>
             </w:r>
           </w:p>
@@ -17932,7 +17972,7 @@
           </w:tcPr>
           <w:p>
             <w:r>
-              <w:t>保活与异常恢复; 最大重连 5 次后回退到 30s 轮询降级</w:t>
+              <w:t>保活与异常恢复; 客户端断线后每 5s 自动重连</w:t>
             </w:r>
           </w:p>
         </w:tc>
@@ -18187,7 +18227,7 @@
           </w:tcPr>
           <w:p>
             <w:r>
-              <w:t>GET /api/show, 12 条/页</w:t>
+              <w:t>GET /api/shows, 12 条 / 页</w:t>
             </w:r>
           </w:p>
         </w:tc>
@@ -18245,7 +18285,7 @@
           </w:tcPr>
           <w:p>
             <w:r>
-              <w:t>GET /api/schedule/{id}/seats, 含座位图渲染</w:t>
+              <w:t>GET /api/schedules/{id}/seats, 含座位图渲染</w:t>
             </w:r>
           </w:p>
         </w:tc>
@@ -18361,7 +18401,7 @@
           </w:tcPr>
           <w:p>
             <w:r>
-              <w:t>POST /api/order</w:t>
+              <w:t>POST /api/orders</w:t>
             </w:r>
           </w:p>
         </w:tc>
@@ -18419,7 +18459,7 @@
           </w:tcPr>
           <w:p>
             <w:r>
-              <w:t>POST /api/payment/mock</w:t>
+              <w:t>POST /api/orders/{id}/pay</w:t>
             </w:r>
           </w:p>
         </w:tc>
@@ -18535,7 +18575,7 @@
           </w:tcPr>
           <w:p>
             <w:r>
-              <w:t>GET /api/stat/dashboard, 含 ECharts 渲染</w:t>
+              <w:t>GET /api/admin/dashboard, 含 ECharts 渲染</w:t>
             </w:r>
           </w:p>
         </w:tc>
@@ -18573,7 +18613,7 @@
           </w:tcPr>
           <w:p>
             <w:r>
-              <w:t>AI 推荐 P95</w:t>
+              <w:t>演出推荐 P95</w:t>
             </w:r>
           </w:p>
         </w:tc>
@@ -18593,7 +18633,7 @@
           </w:tcPr>
           <w:p>
             <w:r>
-              <w:t>GET /api/rec, 含三路打分与排序</w:t>
+              <w:t>GET /api/shows/recommendations/top8, 规则排序</w:t>
             </w:r>
           </w:p>
         </w:tc>
@@ -18709,7 +18749,7 @@
           </w:tcPr>
           <w:p>
             <w:r>
-              <w:t>用户点击座位到 Seat3DPreview 首帧可交互</w:t>
+              <w:t>用户点击座位到 3D 视角预览首帧可交互</w:t>
             </w:r>
           </w:p>
         </w:tc>
@@ -18767,7 +18807,7 @@
           </w:tcPr>
           <w:p>
             <w:r>
-              <w:t>Seat3DPreview 浏览器 RAF 平均帧率</w:t>
+              <w:t>3D 视角预览浏览器 RAF 平均帧率</w:t>
             </w:r>
           </w:p>
         </w:tc>
@@ -19091,7 +19131,7 @@
         <w:pStyle w:val="25"/>
       </w:pPr>
       <w:r>
-        <w:t>权限控制: 基于角色 (RBAC) 与方法注解 @SaCheckRole / @SaCheckPermission 双重控制, 检票员账号不能访问票务管理或系统管理接口.</w:t>
+        <w:t>●  权限控制: 基于 user_account.role 单列角色 (user / admin / checker / sysadmin), 由中央 SaInterceptor 统一拦截 /** 校验 (CORS 预检 OPTIONS 先放行), 检票员账号不能访问票务管理或系统管理接口。</w:t>
       </w:r>
     </w:p>
     <w:p>
@@ -19131,7 +19171,7 @@
         <w:pStyle w:val="25"/>
       </w:pPr>
       <w:r>
-        <w:t>敏感操作审计: 所有管理端关键操作 (剧目、场次、订单、用户/角色) 写入 operation_log, 含操作者、IP、时间、目标 ID.</w:t>
+        <w:t>敏感操作防护: 所有管理端关键操作 (剧目、场次、订单、员工账号) 经统一 SaInterceptor 鉴权与 role 角色校验后执行, 仅授权角色可调用; 集中式操作审计日志为后续规划.</w:t>
       </w:r>
     </w:p>
     <w:p>
@@ -19278,23 +19318,23 @@
     </w:p>
     <w:p>
       <w:r>
-        <w:t>ENCORE 票务管理系统的设计约束在保留通用 B/S + 前后端分离 + 单一鉴权 + 统一数据库规范的基础上, 进一步引入领域驱动设计 (Domain-Driven Design, DDD) 作为后端架构方法, 让系统在功能丰富度提升后仍保持代码可演进性. 整体约束如下:</w:t>
-      </w:r>
-    </w:p>
-    <w:p>
-      <w:pPr>
-        <w:pStyle w:val="25"/>
-      </w:pPr>
-      <w:r>
-        <w:t>架构约束: 必须采用 B/S 架构与前后端分离; 后端遵循 DDD 四层分层 — interface (Controller / WebSocket Endpoint) / application (UseCase / CommandHandler) / domain (Aggregate + ValueObject + DomainService + DomainEvent) / infrastructure (MyBatis-Plus Repository / Redis / 第三方 SDK), 严格控制依赖方向 interface → application → domain ← infrastructure.</w:t>
-      </w:r>
-    </w:p>
-    <w:p>
-      <w:pPr>
-        <w:pStyle w:val="25"/>
-      </w:pPr>
-      <w:r>
-        <w:t>限界上下文约束: 全系统划分为 7 个限界上下文 (Account / Catalog / Scheduling / Ordering / CheckIn / Analytics / Recommendation), 每个上下文拥有独立的聚合根与仓储, 通过显式领域事件 (例如 OrderPaid / SeatLocked / TicketCheckedIn) 跨上下文协作; 上下文之间禁止直接共享数据库表, 防止上下游耦合. 限界上下文清单见表 11, 拓扑结构见图29.</w:t>
+        <w:t>ENCORE 票务管理系统在通用 B/S + 前后端分离 + 单一鉴权 + 统一数据库规范的基础上, 采用清晰的分层架构组织后端代码, 使系统在功能增长后仍保持可维护性。整体约束如下:</w:t>
+      </w:r>
+    </w:p>
+    <w:p>
+      <w:pPr>
+        <w:pStyle w:val="25"/>
+      </w:pPr>
+      <w:r>
+        <w:t>●  架构约束: 必须采用 B/S 架构与前后端分离; 后端按 controller (接口层) → service (业务层) → mapper (MyBatis-Plus 数据访问层) → entity (领域实体) 分层, 依赖单向向下; 实时推送经独立 publisher + STOMP broker。</w:t>
+      </w:r>
+    </w:p>
+    <w:p>
+      <w:pPr>
+        <w:pStyle w:val="25"/>
+      </w:pPr>
+      <w:r>
+        <w:t>●  模块划分约束: 按业务域组织为账号、剧目、场馆与布局、选座、订单与支付、拼座、检票、看板统计、推荐等模块, 各模块以 service 为核心、共享统一实体与 ApiResponse 封装; 模块清单见表 11、分层结构见图29。</w:t>
       </w:r>
     </w:p>
     <w:p>
@@ -19318,15 +19358,15 @@
         <w:pStyle w:val="25"/>
       </w:pPr>
       <w:r>
-        <w:t>数据库约束: 字符集 utf8mb4, 时间字段统一 DATETIME, 金额字段统一 DECIMAL(10,2), 状态字段统一 VARCHAR 枚举值, 严格遵循 limit-context-prefix 命名 (sys_ / show_ / theater_ / schedule_ / ticket_ / payment_ / checkin_).</w:t>
-      </w:r>
-    </w:p>
-    <w:p>
-      <w:pPr>
-        <w:pStyle w:val="25"/>
-      </w:pPr>
-      <w:r>
-        <w:t>AI 与算法约束: AI 演出推荐采用规则 + 协同过滤 + 内容相似度的轻量混合方案, 不引入重型机器学习训练流程; AI 运营助手采用“本地模板优先、外部模型可选”的策略, 设置每日调用额度、单次字数上限、Redis 缓存和超时降级, 避免课程项目产生不可控 API 成本。</w:t>
+        <w:t>●  数据库约束: 字符集 utf8mb4, 时间字段 DATETIME, 金额字段 DECIMAL(10,2), 状态字段 VARCHAR 枚举; 共 13 张业务表, 命名以业务域为前缀 (user_account / encore_show / venue_ / seat_layout_ / show_schedule / schedule_ / ticket_)。</w:t>
+      </w:r>
+    </w:p>
+    <w:p>
+      <w:pPr>
+        <w:pStyle w:val="25"/>
+      </w:pPr>
+      <w:r>
+        <w:t>●  算法约束: 演出推荐采用后端本地规则排序的轻量方案, 不引入机器学习训练流程, 也不依赖外部大模型, 保证零额外 API 成本与稳定响应。</w:t>
       </w:r>
     </w:p>
     <w:p>
@@ -19342,7 +19382,7 @@
         <w:pStyle w:val="25"/>
       </w:pPr>
       <w:r>
-        <w:t>范围约束: 本期不实现真实支付、真实短信、真实硬件扫码、大规模抢票; AI 推荐与 AI 运营助手均可在无外部 API Key 的情况下以本地算法/模板运行, 外部大模型调用不作为验收必要条件。</w:t>
+        <w:t>●  范围约束: 本期不实现真实支付、真实短信、真实硬件扫码、大规模抢票; 演出推荐以本地规则运行, 不依赖外部大模型。</w:t>
       </w:r>
     </w:p>
     <w:p>
@@ -19355,7 +19395,7 @@
     </w:p>
     <w:p>
       <w:r>
-        <w:t>ENCORE 系统的 7 个限界上下文及其核心聚合与上下文映射见表 11.</w:t>
+        <w:t>ENCORE 系统的后端模块划分与职责见表 11。</w:t>
       </w:r>
     </w:p>
     <w:p>
@@ -19364,7 +19404,7 @@
         <w:jc w:val="center"/>
       </w:pPr>
       <w:r>
-        <w:t>表11  ENCORE 领域驱动设计限界上下文</w:t>
+        <w:t>表11  ENCORE 后端模块划分与职责</w:t>
       </w:r>
     </w:p>
     <w:tbl>
@@ -19423,7 +19463,7 @@
               <w:rPr>
                 <w:b/>
               </w:rPr>
-              <w:t>限界上下文</w:t>
+              <w:t>模块</w:t>
             </w:r>
           </w:p>
         </w:tc>
@@ -19439,7 +19479,7 @@
               <w:rPr>
                 <w:b/>
               </w:rPr>
-              <w:t>核心聚合 / 实体</w:t>
+              <w:t>核心服务</w:t>
             </w:r>
           </w:p>
         </w:tc>
@@ -19455,7 +19495,7 @@
               <w:rPr>
                 <w:b/>
               </w:rPr>
-              <w:t>关键业务规则</w:t>
+              <w:t>主要实体 / 表</w:t>
             </w:r>
           </w:p>
         </w:tc>
@@ -19471,7 +19511,7 @@
               <w:rPr>
                 <w:b/>
               </w:rPr>
-              <w:t>协作上下文 (上下文映射)</w:t>
+              <w:t>职责说明</w:t>
             </w:r>
           </w:p>
         </w:tc>
@@ -19499,37 +19539,37 @@
           </w:tcPr>
           <w:p>
             <w:r>
-              <w:t>Account 账号</w:t>
-            </w:r>
-          </w:p>
-        </w:tc>
-        <w:tc>
-          <w:tcPr>
-            <w:tcW w:w="2076" w:type="dxa"/>
-          </w:tcPr>
-          <w:p>
-            <w:r>
-              <w:t>User, Role, Session</w:t>
-            </w:r>
-          </w:p>
-        </w:tc>
-        <w:tc>
-          <w:tcPr>
-            <w:tcW w:w="2076" w:type="dxa"/>
-          </w:tcPr>
-          <w:p>
-            <w:r>
-              <w:t>用户身份与角色权限的唯一来源</w:t>
-            </w:r>
-          </w:p>
-        </w:tc>
-        <w:tc>
-          <w:tcPr>
-            <w:tcW w:w="2076" w:type="dxa"/>
-          </w:tcPr>
-          <w:p>
-            <w:r>
-              <w:t>→ Ordering / CheckIn (Customer-Supplier 用户身份)</w:t>
+              <w:t>账号与权限</w:t>
+            </w:r>
+          </w:p>
+        </w:tc>
+        <w:tc>
+          <w:tcPr>
+            <w:tcW w:w="2076" w:type="dxa"/>
+          </w:tcPr>
+          <w:p>
+            <w:r>
+              <w:t>AuthService / StaffAccountService</w:t>
+            </w:r>
+          </w:p>
+        </w:tc>
+        <w:tc>
+          <w:tcPr>
+            <w:tcW w:w="2076" w:type="dxa"/>
+          </w:tcPr>
+          <w:p>
+            <w:r>
+              <w:t>user_account</w:t>
+            </w:r>
+          </w:p>
+        </w:tc>
+        <w:tc>
+          <w:tcPr>
+            <w:tcW w:w="2076" w:type="dxa"/>
+          </w:tcPr>
+          <w:p>
+            <w:r>
+              <w:t>注册 / 登录 / 登出 (Sa-Token)、员工账号与角色 (role 单列)、口令 BCrypt</w:t>
             </w:r>
           </w:p>
         </w:tc>
@@ -19557,37 +19597,37 @@
           </w:tcPr>
           <w:p>
             <w:r>
-              <w:t>Catalog 剧目</w:t>
-            </w:r>
-          </w:p>
-        </w:tc>
-        <w:tc>
-          <w:tcPr>
-            <w:tcW w:w="2076" w:type="dxa"/>
-          </w:tcPr>
-          <w:p>
-            <w:r>
-              <w:t>ShowInfo, ShowCategory</w:t>
-            </w:r>
-          </w:p>
-        </w:tc>
-        <w:tc>
-          <w:tcPr>
-            <w:tcW w:w="2076" w:type="dxa"/>
-          </w:tcPr>
-          <w:p>
-            <w:r>
-              <w:t>剧目元数据与分类的唯一来源</w:t>
-            </w:r>
-          </w:p>
-        </w:tc>
-        <w:tc>
-          <w:tcPr>
-            <w:tcW w:w="2076" w:type="dxa"/>
-          </w:tcPr>
-          <w:p>
-            <w:r>
-              <w:t>→ Scheduling (Customer-Supplier 剧目元数据); → Recommendation (Conformist)</w:t>
+              <w:t>剧目与推荐</w:t>
+            </w:r>
+          </w:p>
+        </w:tc>
+        <w:tc>
+          <w:tcPr>
+            <w:tcW w:w="2076" w:type="dxa"/>
+          </w:tcPr>
+          <w:p>
+            <w:r>
+              <w:t>ShowService</w:t>
+            </w:r>
+          </w:p>
+        </w:tc>
+        <w:tc>
+          <w:tcPr>
+            <w:tcW w:w="2076" w:type="dxa"/>
+          </w:tcPr>
+          <w:p>
+            <w:r>
+              <w:t>encore_show</w:t>
+            </w:r>
+          </w:p>
+        </w:tc>
+        <w:tc>
+          <w:tcPr>
+            <w:tcW w:w="2076" w:type="dxa"/>
+          </w:tcPr>
+          <w:p>
+            <w:r>
+              <w:t>剧目档案 CRUD、浏览 / 搜索 / 详情、首页 Top8 规则推荐</w:t>
             </w:r>
           </w:p>
         </w:tc>
@@ -19615,37 +19655,37 @@
           </w:tcPr>
           <w:p>
             <w:r>
-              <w:t>Scheduling 排期</w:t>
-            </w:r>
-          </w:p>
-        </w:tc>
-        <w:tc>
-          <w:tcPr>
-            <w:tcW w:w="2076" w:type="dxa"/>
-          </w:tcPr>
-          <w:p>
-            <w:r>
-              <w:t>ShowSchedule, ScheduleSeat, TheaterHall, HallSeat</w:t>
-            </w:r>
-          </w:p>
-        </w:tc>
-        <w:tc>
-          <w:tcPr>
-            <w:tcW w:w="2076" w:type="dxa"/>
-          </w:tcPr>
-          <w:p>
-            <w:r>
-              <w:t>场次状态机 (DRAFT/ON_SALE/STOP_SALE/FINISHED/CANCELLED) 与座位票池生成</w:t>
-            </w:r>
-          </w:p>
-        </w:tc>
-        <w:tc>
-          <w:tcPr>
-            <w:tcW w:w="2076" w:type="dxa"/>
-          </w:tcPr>
-          <w:p>
-            <w:r>
-              <w:t>→ Ordering (OHS-PL 场次座位票池); → Analytics (Conformist 上座率事件)</w:t>
+              <w:t>场馆与布局</w:t>
+            </w:r>
+          </w:p>
+        </w:tc>
+        <w:tc>
+          <w:tcPr>
+            <w:tcW w:w="2076" w:type="dxa"/>
+          </w:tcPr>
+          <w:p>
+            <w:r>
+              <w:t>VenueManagementService</w:t>
+            </w:r>
+          </w:p>
+        </w:tc>
+        <w:tc>
+          <w:tcPr>
+            <w:tcW w:w="2076" w:type="dxa"/>
+          </w:tcPr>
+          <w:p>
+            <w:r>
+              <w:t>venue / venue_hall / seat_layout / seat_layout_area / seat_layout_seat / venue_area</w:t>
+            </w:r>
+          </w:p>
+        </w:tc>
+        <w:tc>
+          <w:tcPr>
+            <w:tcW w:w="2076" w:type="dxa"/>
+          </w:tcPr>
+          <w:p>
+            <w:r>
+              <w:t>场馆 / 演出厅 / 座位布局维护与发布、区域定义</w:t>
             </w:r>
           </w:p>
         </w:tc>
@@ -19673,37 +19713,37 @@
           </w:tcPr>
           <w:p>
             <w:r>
-              <w:t>Ordering 订单</w:t>
-            </w:r>
-          </w:p>
-        </w:tc>
-        <w:tc>
-          <w:tcPr>
-            <w:tcW w:w="2076" w:type="dxa"/>
-          </w:tcPr>
-          <w:p>
-            <w:r>
-              <w:t>TicketOrder, TicketItem, PaymentRecord</w:t>
-            </w:r>
-          </w:p>
-        </w:tc>
-        <w:tc>
-          <w:tcPr>
-            <w:tcW w:w="2076" w:type="dxa"/>
-          </w:tcPr>
-          <w:p>
-            <w:r>
-              <w:t>订单状态机 + 15 分钟倒计时 + Redis 座位锁一致性</w:t>
-            </w:r>
-          </w:p>
-        </w:tc>
-        <w:tc>
-          <w:tcPr>
-            <w:tcW w:w="2076" w:type="dxa"/>
-          </w:tcPr>
-          <w:p>
-            <w:r>
-              <w:t>← Account / Scheduling (Customer-Supplier); → CheckIn / Analytics / Recommendation (Conformist 订单事件)</w:t>
+              <w:t>场次排期</w:t>
+            </w:r>
+          </w:p>
+        </w:tc>
+        <w:tc>
+          <w:tcPr>
+            <w:tcW w:w="2076" w:type="dxa"/>
+          </w:tcPr>
+          <w:p>
+            <w:r>
+              <w:t>AdminService (排期)</w:t>
+            </w:r>
+          </w:p>
+        </w:tc>
+        <w:tc>
+          <w:tcPr>
+            <w:tcW w:w="2076" w:type="dxa"/>
+          </w:tcPr>
+          <w:p>
+            <w:r>
+              <w:t>show_schedule / schedule_seat / schedule_area_inventory</w:t>
+            </w:r>
+          </w:p>
+        </w:tc>
+        <w:tc>
+          <w:tcPr>
+            <w:tcW w:w="2076" w:type="dxa"/>
+          </w:tcPr>
+          <w:p>
+            <w:r>
+              <w:t>场次创建、布局快照生成票池与区域库存、同厅冲突校验、状态机</w:t>
             </w:r>
           </w:p>
         </w:tc>
@@ -19731,37 +19771,37 @@
           </w:tcPr>
           <w:p>
             <w:r>
-              <w:t>CheckIn 检票</w:t>
-            </w:r>
-          </w:p>
-        </w:tc>
-        <w:tc>
-          <w:tcPr>
-            <w:tcW w:w="2076" w:type="dxa"/>
-          </w:tcPr>
-          <w:p>
-            <w:r>
-              <w:t>CheckinRecord</w:t>
-            </w:r>
-          </w:p>
-        </w:tc>
-        <w:tc>
-          <w:tcPr>
-            <w:tcW w:w="2076" w:type="dxa"/>
-          </w:tcPr>
-          <w:p>
-            <w:r>
-              <w:t>票据状态机 (UNUSED/CHECKED_IN/INVALID/REFUNDED) 与防重复检票</w:t>
-            </w:r>
-          </w:p>
-        </w:tc>
-        <w:tc>
-          <w:tcPr>
-            <w:tcW w:w="2076" w:type="dxa"/>
-          </w:tcPr>
-          <w:p>
-            <w:r>
-              <w:t>← Account / Ordering (Customer-Supplier)</w:t>
+              <w:t>选座·订单·支付</w:t>
+            </w:r>
+          </w:p>
+        </w:tc>
+        <w:tc>
+          <w:tcPr>
+            <w:tcW w:w="2076" w:type="dxa"/>
+          </w:tcPr>
+          <w:p>
+            <w:r>
+              <w:t>SeatService / OrderService / SeatStatusPublisher</w:t>
+            </w:r>
+          </w:p>
+        </w:tc>
+        <w:tc>
+          <w:tcPr>
+            <w:tcW w:w="2076" w:type="dxa"/>
+          </w:tcPr>
+          <w:p>
+            <w:r>
+              <w:t>schedule_seat / schedule_area_inventory / ticket_order / ticket_item</w:t>
+            </w:r>
+          </w:p>
+        </w:tc>
+        <w:tc>
+          <w:tcPr>
+            <w:tcW w:w="2076" w:type="dxa"/>
+          </w:tcPr>
+          <w:p>
+            <w:r>
+              <w:t>Redis 座位锁、区域库存 CAS、下单与 15 分钟倒计时、模拟支付、票据生成、STOMP 实时广播</w:t>
             </w:r>
           </w:p>
         </w:tc>
@@ -19789,37 +19829,37 @@
           </w:tcPr>
           <w:p>
             <w:r>
-              <w:t>Analytics 分析</w:t>
-            </w:r>
-          </w:p>
-        </w:tc>
-        <w:tc>
-          <w:tcPr>
-            <w:tcW w:w="2076" w:type="dxa"/>
-          </w:tcPr>
-          <w:p>
-            <w:r>
-              <w:t>DashboardVO, StatAggregator</w:t>
-            </w:r>
-          </w:p>
-        </w:tc>
-        <w:tc>
-          <w:tcPr>
-            <w:tcW w:w="2076" w:type="dxa"/>
-          </w:tcPr>
-          <w:p>
-            <w:r>
-              <w:t>聚合 SQL + Redis 60 秒缓存; 实时事件局部刷新看板</w:t>
-            </w:r>
-          </w:p>
-        </w:tc>
-        <w:tc>
-          <w:tcPr>
-            <w:tcW w:w="2076" w:type="dxa"/>
-          </w:tcPr>
-          <w:p>
-            <w:r>
-              <w:t>← Ordering / Scheduling (Conformist)</w:t>
+              <w:t>拼座与检票</w:t>
+            </w:r>
+          </w:p>
+        </w:tc>
+        <w:tc>
+          <w:tcPr>
+            <w:tcW w:w="2076" w:type="dxa"/>
+          </w:tcPr>
+          <w:p>
+            <w:r>
+              <w:t>GroupOrderService / CheckInService</w:t>
+            </w:r>
+          </w:p>
+        </w:tc>
+        <w:tc>
+          <w:tcPr>
+            <w:tcW w:w="2076" w:type="dxa"/>
+          </w:tcPr>
+          <w:p>
+            <w:r>
+              <w:t>ticket_order / ticket_item (+ Redis 会话)</w:t>
+            </w:r>
+          </w:p>
+        </w:tc>
+        <w:tc>
+          <w:tcPr>
+            <w:tcW w:w="2076" w:type="dxa"/>
+          </w:tcPr>
+          <w:p>
+            <w:r>
+              <w:t>拼座 create / join / checkout 群锁; 检票窗口校验与 CHECKED_IN 翻转</w:t>
             </w:r>
           </w:p>
         </w:tc>
@@ -19847,37 +19887,37 @@
           </w:tcPr>
           <w:p>
             <w:r>
-              <w:t>Recommendation 推荐</w:t>
-            </w:r>
-          </w:p>
-        </w:tc>
-        <w:tc>
-          <w:tcPr>
-            <w:tcW w:w="2076" w:type="dxa"/>
-          </w:tcPr>
-          <w:p>
-            <w:r>
-              <w:t>RecommendVO, RecallEngine, RankingEngine</w:t>
-            </w:r>
-          </w:p>
-        </w:tc>
-        <w:tc>
-          <w:tcPr>
-            <w:tcW w:w="2076" w:type="dxa"/>
-          </w:tcPr>
-          <w:p>
-            <w:r>
-              <w:t>三路混合排序 + 规则兜底 + 10 分钟用户级缓存</w:t>
-            </w:r>
-          </w:p>
-        </w:tc>
-        <w:tc>
-          <w:tcPr>
-            <w:tcW w:w="2076" w:type="dxa"/>
-          </w:tcPr>
-          <w:p>
-            <w:r>
-              <w:t>← Catalog / Ordering (Conformist)</w:t>
+              <w:t>数据看板</w:t>
+            </w:r>
+          </w:p>
+        </w:tc>
+        <w:tc>
+          <w:tcPr>
+            <w:tcW w:w="2076" w:type="dxa"/>
+          </w:tcPr>
+          <w:p>
+            <w:r>
+              <w:t>AdminService / DashboardRefreshPublisher</w:t>
+            </w:r>
+          </w:p>
+        </w:tc>
+        <w:tc>
+          <w:tcPr>
+            <w:tcW w:w="2076" w:type="dxa"/>
+          </w:tcPr>
+          <w:p>
+            <w:r>
+              <w:t>聚合视图 (ticket_order / ticket_item ...)</w:t>
+            </w:r>
+          </w:p>
+        </w:tc>
+        <w:tc>
+          <w:tcPr>
+            <w:tcW w:w="2076" w:type="dxa"/>
+          </w:tcPr>
+          <w:p>
+            <w:r>
+              <w:t>应用层内存聚合 KPI、/topic/admin/dashboard 刷新信号</w:t>
             </w:r>
           </w:p>
         </w:tc>
@@ -19885,7 +19925,7 @@
     </w:tbl>
     <w:p>
       <w:r>
-        <w:t>表 11 与图29 共同描述 ENCORE 的领域分解. 上下文映射类型说明: Customer-Supplier 表示存在强业务依赖且双方协商接口; OHS-PL (Open Host Service + Published Language) 用于稳定共享的发布数据契约, 例如场次座位票池; Conformist 表示下游被动跟随上游模型, 例如分析与推荐上下文消费订单事件.</w:t>
+        <w:t>表 11 与图29 共同描述 ENCORE 的后端分层与模块组织: 控制层经统一 SaInterceptor 鉴权后委派业务层, 业务层经 MyBatis-Plus Mapper 访问 MySQL、经 StringRedisTemplate 访问 Redis, 并通过 SeatStatusPublisher / DashboardRefreshPublisher 经 STOMP 广播实时事件。</w:t>
       </w:r>
     </w:p>
     <w:p>
@@ -19895,7 +19935,7 @@
       <w:r>
         <w:drawing>
           <wp:inline distT="0" distB="0" distL="114300" distR="114300">
-            <wp:extent cx="5039995" cy="2725420"/>
+            <wp:extent cx="5039995" cy="3089532"/>
             <wp:effectExtent l="0" t="0" r="1905" b="5080"/>
             <wp:docPr id="29" name="Picture 29"/>
             <wp:cNvGraphicFramePr>
@@ -19919,7 +19959,7 @@
                   <pic:spPr>
                     <a:xfrm>
                       <a:off x="0" y="0"/>
-                      <a:ext cx="5040000" cy="2725877"/>
+                      <a:ext cx="5039995" cy="3089532"/>
                     </a:xfrm>
                     <a:prstGeom prst="rect">
                       <a:avLst/>
@@ -19938,7 +19978,7 @@
         <w:jc w:val="center"/>
       </w:pPr>
       <w:r>
-        <w:t>图29  ENCORE 领域驱动设计 (DDD) 限界上下文图</w:t>
+        <w:t>图29  ENCORE 分层架构与模块划分图</w:t>
       </w:r>
     </w:p>
     <w:p>
@@ -20626,7 +20666,7 @@
           </w:tcPr>
           <w:p>
             <w:r>
-              <w:t>票务管理员可完成剧目、分类、演出厅、座位、场次、票池、订单、公告管理</w:t>
+              <w:t>票务管理员可完成剧目、场馆与演出厅、座位布局、场次、票池与区域库存、订单管理</w:t>
             </w:r>
           </w:p>
         </w:tc>
@@ -20742,7 +20782,7 @@
           </w:tcPr>
           <w:p>
             <w:r>
-              <w:t>系统管理员可管理账号、角色、权限并查看操作日志</w:t>
+              <w:t>系统管理员可创建 / 禁用 / 重置员工账号并分配 user / admin / checker / sysadmin 角色</w:t>
             </w:r>
           </w:p>
         </w:tc>
@@ -20858,7 +20898,7 @@
           </w:tcPr>
           <w:p>
             <w:r>
-              <w:t>密码 BCrypt 存储, 登录失败 5 次锁定, 操作日志完整记录, prod profile 关闭 Knife4j /doc.html</w:t>
+              <w:t>密码 BCrypt 存储, 统一 SaInterceptor 鉴权, 检票员越权访问被拒, prod profile 关闭 Knife4j /doc.html</w:t>
             </w:r>
           </w:p>
         </w:tc>
@@ -21206,7 +21246,7 @@
           </w:tcPr>
           <w:p>
             <w:r>
-              <w:t>管理端数据看板呈现黑金指挥中心风格, 含 Sankey 漏斗、座位热力图、Bar Race, 关键卡片在订单 / 检票事件触发时实时刷新</w:t>
+              <w:t>管理端数据看板呈现深色 + 金色风格, 含营收 / 订单 / 售票 / 检票 KPI 卡、近 7 日折线 + 柱状双轴、Top5 热门演出横向柱, 下单 / 支付 / 检票事件触发实时刷新</w:t>
             </w:r>
           </w:p>
         </w:tc>
@@ -21264,7 +21304,7 @@
           </w:tcPr>
           <w:p>
             <w:r>
-              <w:t>首页"猜你喜欢"位返回 Top 8 推荐, 注册用户与游客推荐结果差异化, 冷启动时规则兜底, 接口 P95 ≤ 1.5 秒</w:t>
+              <w:t>首页猜你喜欢位返回全局 Top8 推荐 (规则排序, 对所有用户一致), 无数据时显示空状态, 接口 P95 ≤ 1.5 秒</w:t>
             </w:r>
           </w:p>
         </w:tc>
@@ -21322,7 +21362,65 @@
           </w:tcPr>
           <w:p>
             <w:r>
-              <w:t>用户在选座页生成拼座邀请链接 / 二维码, 邀请人扫码后能加入同场次并锁同一组座位, 合并为一笔订单</w:t>
+              <w:t>用户生成拼座邀请码, 受邀人加入同场次联合锁座, 发起人合并为一笔订单结算支付</w:t>
+            </w:r>
+          </w:p>
+        </w:tc>
+        <w:tc>
+          <w:tcPr>
+            <w:tcW w:w="2076" w:type="dxa"/>
+          </w:tcPr>
+          <w:p>
+            <w:r>
+              <w:t>建议</w:t>
+            </w:r>
+          </w:p>
+        </w:tc>
+      </w:tr>
+      <w:tr>
+        <w:tblPrEx>
+          <w:tblBorders>
+            <w:top w:val="single" w:color="000000" w:sz="4" w:space="0"/>
+            <w:left w:val="single" w:color="000000" w:sz="4" w:space="0"/>
+            <w:bottom w:val="single" w:color="000000" w:sz="4" w:space="0"/>
+            <w:right w:val="single" w:color="000000" w:sz="4" w:space="0"/>
+            <w:insideH w:val="single" w:color="000000" w:sz="4" w:space="0"/>
+            <w:insideV w:val="single" w:color="000000" w:sz="4" w:space="0"/>
+          </w:tblBorders>
+          <w:tblCellMar>
+            <w:top w:w="0" w:type="dxa"/>
+            <w:left w:w="108" w:type="dxa"/>
+            <w:bottom w:w="0" w:type="dxa"/>
+            <w:right w:w="108" w:type="dxa"/>
+          </w:tblCellMar>
+        </w:tblPrEx>
+        <w:tc>
+          <w:tcPr>
+            <w:tcW w:w="2076" w:type="dxa"/>
+          </w:tcPr>
+          <w:p>
+            <w:r>
+              <w:t>AC-21</w:t>
+            </w:r>
+          </w:p>
+        </w:tc>
+        <w:tc>
+          <w:tcPr>
+            <w:tcW w:w="2076" w:type="dxa"/>
+          </w:tcPr>
+          <w:p>
+            <w:r>
+              <w:t>差异化 - 区域售票</w:t>
+            </w:r>
+          </w:p>
+        </w:tc>
+        <w:tc>
+          <w:tcPr>
+            <w:tcW w:w="2076" w:type="dxa"/>
+          </w:tcPr>
+          <w:p>
+            <w:r>
+              <w:t>ZONED / MIXED 场次可按区域选 1~4 张下单, 库存 total / available / locked / sold 原子扣减防超卖, 支付后 sold 累加并实时广播</w:t>
             </w:r>
           </w:p>
         </w:tc>
@@ -21841,7 +21939,7 @@
           </w:tcPr>
           <w:p>
             <w:r>
-              <w:t>ENCORE 票务管理系统 SRS V1.0</w:t>
+              <w:t>ENCORE 票务管理系统 SRS V1.1</w:t>
             </w:r>
           </w:p>
         </w:tc>
@@ -22015,7 +22113,7 @@
           </w:tcPr>
           <w:p>
             <w:r>
-              <w:t>15 张表 CREATE + 初始化数据</w:t>
+              <w:t>13 张表 CREATE + 初始化数据</w:t>
             </w:r>
           </w:p>
         </w:tc>
@@ -22131,7 +22229,7 @@
           </w:tcPr>
           <w:p>
             <w:r>
-              <w:t>Spring Boot 3 + Sa-Token + MyBatis-Plus + Spring WebSocket; DDD 四层 + 7 限界上下文</w:t>
+              <w:t>Spring Boot 3 + Sa-Token + MyBatis-Plus + Spring WebSocket; controller / service / mapper / entity 分层</w:t>
             </w:r>
           </w:p>
         </w:tc>
@@ -22247,7 +22345,7 @@
           </w:tcPr>
           <w:p>
             <w:r>
-              <w:t>29 张架构 / 用例 / 活动 / 顺序 / 类 / 状态 / ER / WebSocket / 3D / 看板 / DDD 上下文图</w:t>
+              <w:t>31 张架构 / 用例 / 活动 / 顺序 / 类 / 状态 / ER / WebSocket / 3D / 看板 / 分层架构图</w:t>
             </w:r>
           </w:p>
         </w:tc>
@@ -22459,27 +22557,27 @@
           </w:tcPr>
           <w:p>
             <w:r>
-              <w:t>DDD 限界上下文与领域模型扩展文档</w:t>
-            </w:r>
-          </w:p>
-        </w:tc>
-        <w:tc>
-          <w:tcPr>
-            <w:tcW w:w="2076" w:type="dxa"/>
-          </w:tcPr>
-          <w:p>
-            <w:r>
-              <w:t>PDF + DOCX</w:t>
-            </w:r>
-          </w:p>
-        </w:tc>
-        <w:tc>
-          <w:tcPr>
-            <w:tcW w:w="2076" w:type="dxa"/>
-          </w:tcPr>
-          <w:p>
-            <w:r>
-              <w:t>7 个限界上下文的聚合 / 实体 / 值对象详述, 含上下文映射图与领域事件清单</w:t>
+              <w:t>JMeter 全链路压测报告</w:t>
+            </w:r>
+          </w:p>
+        </w:tc>
+        <w:tc>
+          <w:tcPr>
+            <w:tcW w:w="2076" w:type="dxa"/>
+          </w:tcPr>
+          <w:p>
+            <w:r>
+              <w:t>JMX + HTML + PDF</w:t>
+            </w:r>
+          </w:p>
+        </w:tc>
+        <w:tc>
+          <w:tcPr>
+            <w:tcW w:w="2076" w:type="dxa"/>
+          </w:tcPr>
+          <w:p>
+            <w:r>
+              <w:t>JMeter 5.6 脚本与执行结果; 覆盖 8 个核心 REST 接口 + WebSocket 长连接; 含 P95 / 错误率 / TPS 曲线</w:t>
             </w:r>
           </w:p>
         </w:tc>
@@ -22517,64 +22615,6 @@
           </w:tcPr>
           <w:p>
             <w:r>
-              <w:t>JMeter 全链路压测报告</w:t>
-            </w:r>
-          </w:p>
-        </w:tc>
-        <w:tc>
-          <w:tcPr>
-            <w:tcW w:w="2076" w:type="dxa"/>
-          </w:tcPr>
-          <w:p>
-            <w:r>
-              <w:t>JMX + HTML + PDF</w:t>
-            </w:r>
-          </w:p>
-        </w:tc>
-        <w:tc>
-          <w:tcPr>
-            <w:tcW w:w="2076" w:type="dxa"/>
-          </w:tcPr>
-          <w:p>
-            <w:r>
-              <w:t>JMeter 5.6 脚本与执行结果; 覆盖 8 个核心 REST 接口 + WebSocket 长连接; 含 P95 / 错误率 / TPS 曲线</w:t>
-            </w:r>
-          </w:p>
-        </w:tc>
-      </w:tr>
-      <w:tr>
-        <w:tblPrEx>
-          <w:tblBorders>
-            <w:top w:val="single" w:color="000000" w:sz="4" w:space="0"/>
-            <w:left w:val="single" w:color="000000" w:sz="4" w:space="0"/>
-            <w:bottom w:val="single" w:color="000000" w:sz="4" w:space="0"/>
-            <w:right w:val="single" w:color="000000" w:sz="4" w:space="0"/>
-            <w:insideH w:val="single" w:color="000000" w:sz="4" w:space="0"/>
-            <w:insideV w:val="single" w:color="000000" w:sz="4" w:space="0"/>
-          </w:tblBorders>
-          <w:tblCellMar>
-            <w:top w:w="0" w:type="dxa"/>
-            <w:left w:w="108" w:type="dxa"/>
-            <w:bottom w:w="0" w:type="dxa"/>
-            <w:right w:w="108" w:type="dxa"/>
-          </w:tblCellMar>
-        </w:tblPrEx>
-        <w:tc>
-          <w:tcPr>
-            <w:tcW w:w="2076" w:type="dxa"/>
-          </w:tcPr>
-          <w:p>
-            <w:r>
-              <w:t>DV-14</w:t>
-            </w:r>
-          </w:p>
-        </w:tc>
-        <w:tc>
-          <w:tcPr>
-            <w:tcW w:w="2076" w:type="dxa"/>
-          </w:tcPr>
-          <w:p>
-            <w:r>
               <w:t>Skywalking 链路追踪截图集</w:t>
             </w:r>
           </w:p>
@@ -22603,7 +22643,7 @@
     </w:tbl>
     <w:p>
       <w:r>
-        <w:t>交付方式: 全部交付物以电子件形式提交至课程指导教师指定的代码仓库与文档库。文档类交付物提交 PDF + 源 DOCX 两种格式; 源代码提交 Git 仓库链接并附最终发布版本标签 (tag) v1.0.0。DV-11 ~ DV-14 为本期差异化能力 (WebSocket / 3D / DDD / 智能推荐) 配套的工程化交付物, 用于评审现场的可演示性与可验证性。</w:t>
+        <w:t>交付方式: 全部交付物以电子件形式提交至课程指导教师指定的代码仓库与文档库。文档类交付物提交 PDF + 源 DOCX 两种格式; 源代码提交 Git 仓库链接并附最终发布版本标签 (tag) v1.1.0。DV-11 ~ DV-13 为接口文档、全链路压测与链路追踪等工程化交付物, 用于评审现场的可演示性与可验证性。</w:t>
       </w:r>
     </w:p>
     <w:p>

</xml_diff>